<commit_message>
fix(manual): reiniciar la numeracion de los pasos en los modulos nuevos
Reportado: los "PASOS DE USO" de Crear Periodo y Publicar Linking
continuaban la cuenta del modulo anterior (8, 9, 10...) en vez de
empezar en 1.

Causa: en Word el contador de una lista vive en el abstractNum, no en el
numId. Varios numId que comparten el mismo abstractNum siguen la misma
cuenta salvo que cada uno declare <w:lvlOverride><w:startOverride
w:val="1"/>. Los numId originales del manual (1-8) si lo traian; los
agregados para los modulos nuevos no.

Fix: se agrega el startOverride a los numId nuevos (9-14, que es como
Word los renumero al guardar el documento). Ahora cada lista de pasos
reinicia en 1, igual que en el resto del manual.

Se parte del .docx que devolvio el usuario (con sus cambios y control de
cambios intactos) y solo se modifica numbering.xml: document.xml queda
byte a byte igual, 186 parrafos antes y despues.
</commit_message>
<xml_diff>
--- a/Manual_Auditor_CGE.docx
+++ b/Manual_Auditor_CGE.docx
@@ -1,17 +1,17 @@
 
 <file path=word/document.xml><?xml version="1.0" encoding="utf-8"?>
-<w:document xmlns:wpc="http://schemas.microsoft.com/office/word/2010/wordprocessingCanvas" xmlns:cx="http://schemas.microsoft.com/office/drawing/2014/chartex" xmlns:cx1="http://schemas.microsoft.com/office/drawing/2015/9/8/chartex" xmlns:cx2="http://schemas.microsoft.com/office/drawing/2015/10/21/chartex" xmlns:cx3="http://schemas.microsoft.com/office/drawing/2016/5/9/chartex" xmlns:cx4="http://schemas.microsoft.com/office/drawing/2016/5/10/chartex" xmlns:cx5="http://schemas.microsoft.com/office/drawing/2016/5/11/chartex" xmlns:cx6="http://schemas.microsoft.com/office/drawing/2016/5/12/chartex" xmlns:cx7="http://schemas.microsoft.com/office/drawing/2016/5/13/chartex" xmlns:cx8="http://schemas.microsoft.com/office/drawing/2016/5/14/chartex" xmlns:mc="http://schemas.openxmlformats.org/markup-compatibility/2006" xmlns:aink="http://schemas.microsoft.com/office/drawing/2016/ink" xmlns:am3d="http://schemas.microsoft.com/office/drawing/2017/model3d" xmlns:o="urn:schemas-microsoft-com:office:office" xmlns:oel="http://schemas.microsoft.com/office/2019/extlst" xmlns:r="http://schemas.openxmlformats.org/officeDocument/2006/relationships" xmlns:m="http://schemas.openxmlformats.org/officeDocument/2006/math" xmlns:v="urn:schemas-microsoft-com:vml" xmlns:wp14="http://schemas.microsoft.com/office/word/2010/wordprocessingDrawing" xmlns:wp="http://schemas.openxmlformats.org/drawingml/2006/wordprocessingDrawing" xmlns:w10="urn:schemas-microsoft-com:office:word" xmlns:w="http://schemas.openxmlformats.org/wordprocessingml/2006/main" xmlns:w14="http://schemas.microsoft.com/office/word/2010/wordml" xmlns:w15="http://schemas.microsoft.com/office/word/2012/wordml" xmlns:w16cex="http://schemas.microsoft.com/office/word/2018/wordml/cex" xmlns:w16cid="http://schemas.microsoft.com/office/word/2016/wordml/cid" xmlns:w16="http://schemas.microsoft.com/office/word/2018/wordml" xmlns:w16du="http://schemas.microsoft.com/office/word/2023/wordml/word16du" xmlns:w16sdtdh="http://schemas.microsoft.com/office/word/2020/wordml/sdtdatahash" xmlns:w16sdtfl="http://schemas.microsoft.com/office/word/2024/wordml/sdtformatlock" xmlns:w16se="http://schemas.microsoft.com/office/word/2015/wordml/symex" xmlns:wpg="http://schemas.microsoft.com/office/word/2010/wordprocessingGroup" xmlns:wpi="http://schemas.microsoft.com/office/word/2010/wordprocessingInk" xmlns:wne="http://schemas.microsoft.com/office/word/2006/wordml" xmlns:wps="http://schemas.microsoft.com/office/word/2010/wordprocessingShape" xmlns:a="http://schemas.openxmlformats.org/drawingml/2006/main" xmlns:a16="http://schemas.microsoft.com/office/drawing/2014/main" xmlns:pic="http://schemas.openxmlformats.org/drawingml/2006/picture" xmlns:a14="http://schemas.microsoft.com/office/drawing/2010/main" mc:Ignorable="w14 w15 w16se w16cid w16 w16cex w16sdtdh w16sdtfl w16du wp14">
+<w:document xmlns:wpc="http://schemas.microsoft.com/office/word/2010/wordprocessingCanvas" xmlns:cx="http://schemas.microsoft.com/office/drawing/2014/chartex" xmlns:cx1="http://schemas.microsoft.com/office/drawing/2015/9/8/chartex" xmlns:cx2="http://schemas.microsoft.com/office/drawing/2015/10/21/chartex" xmlns:cx3="http://schemas.microsoft.com/office/drawing/2016/5/9/chartex" xmlns:cx4="http://schemas.microsoft.com/office/drawing/2016/5/10/chartex" xmlns:cx5="http://schemas.microsoft.com/office/drawing/2016/5/11/chartex" xmlns:cx6="http://schemas.microsoft.com/office/drawing/2016/5/12/chartex" xmlns:cx7="http://schemas.microsoft.com/office/drawing/2016/5/13/chartex" xmlns:cx8="http://schemas.microsoft.com/office/drawing/2016/5/14/chartex" xmlns:mc="http://schemas.openxmlformats.org/markup-compatibility/2006" xmlns:aink="http://schemas.microsoft.com/office/drawing/2016/ink" xmlns:am3d="http://schemas.microsoft.com/office/drawing/2017/model3d" xmlns:o="urn:schemas-microsoft-com:office:office" xmlns:oel="http://schemas.microsoft.com/office/2019/extlst" xmlns:r="http://schemas.openxmlformats.org/officeDocument/2006/relationships" xmlns:m="http://schemas.openxmlformats.org/officeDocument/2006/math" xmlns:v="urn:schemas-microsoft-com:vml" xmlns:wp14="http://schemas.microsoft.com/office/word/2010/wordprocessingDrawing" xmlns:wp="http://schemas.openxmlformats.org/drawingml/2006/wordprocessingDrawing" xmlns:w10="urn:schemas-microsoft-com:office:word" xmlns:w="http://schemas.openxmlformats.org/wordprocessingml/2006/main" xmlns:w14="http://schemas.microsoft.com/office/word/2010/wordml" xmlns:w15="http://schemas.microsoft.com/office/word/2012/wordml" xmlns:w16cei="http://schemas.microsoft.com/office/word/2026/wordml/cei" xmlns:w16cex="http://schemas.microsoft.com/office/word/2018/wordml/cex" xmlns:w16cid="http://schemas.microsoft.com/office/word/2016/wordml/cid" xmlns:w16="http://schemas.microsoft.com/office/word/2018/wordml" xmlns:w16du="http://schemas.microsoft.com/office/word/2023/wordml/word16du" xmlns:w16sdtdh="http://schemas.microsoft.com/office/word/2020/wordml/sdtdatahash" xmlns:w16sdtfl="http://schemas.microsoft.com/office/word/2024/wordml/sdtformatlock" xmlns:w16se="http://schemas.microsoft.com/office/word/2015/wordml/symex" xmlns:wpg="http://schemas.microsoft.com/office/word/2010/wordprocessingGroup" xmlns:wpi="http://schemas.microsoft.com/office/word/2010/wordprocessingInk" xmlns:wne="http://schemas.microsoft.com/office/word/2006/wordml" xmlns:wps="http://schemas.microsoft.com/office/word/2010/wordprocessingShape" mc:Ignorable="w14 w15 w16se w16cid w16 w16cex w16sdtdh w16sdtfl w16du wp14">
   <w:body>
     <w:tbl>
       <w:tblPr>
         <w:tblW w:w="9360" w:type="dxa"/>
         <w:tblBorders>
-          <w:top w:val="none" w:color="FFFFFF" w:sz="0" w:space="0"/>
-          <w:left w:val="none" w:color="FFFFFF" w:sz="0" w:space="0"/>
-          <w:bottom w:val="none" w:color="FFFFFF" w:sz="0" w:space="0"/>
-          <w:right w:val="none" w:color="FFFFFF" w:sz="0" w:space="0"/>
-          <w:insideH w:val="none" w:color="FFFFFF" w:sz="0" w:space="0"/>
-          <w:insideV w:val="none" w:color="FFFFFF" w:sz="0" w:space="0"/>
+          <w:top w:val="none" w:sz="0" w:space="0" w:color="FFFFFF"/>
+          <w:left w:val="none" w:sz="0" w:space="0" w:color="FFFFFF"/>
+          <w:bottom w:val="none" w:sz="0" w:space="0" w:color="FFFFFF"/>
+          <w:right w:val="none" w:sz="0" w:space="0" w:color="FFFFFF"/>
+          <w:insideH w:val="none" w:sz="0" w:space="0" w:color="FFFFFF"/>
+          <w:insideV w:val="none" w:sz="0" w:space="0" w:color="FFFFFF"/>
         </w:tblBorders>
         <w:tblCellMar>
           <w:left w:w="10" w:type="dxa"/>
@@ -93,7 +93,7 @@
     </w:p>
     <w:p>
       <w:pPr>
-        <w:pStyle w:val="Heading1"/>
+        <w:pStyle w:val="Ttulo1"/>
       </w:pPr>
       <w:r>
         <w:t>¿Qué es el Auditor?</w:t>
@@ -153,7 +153,7 @@
     </w:p>
     <w:p>
       <w:pPr>
-        <w:pStyle w:val="Heading1"/>
+        <w:pStyle w:val="Ttulo1"/>
       </w:pPr>
       <w:r>
         <w:t>Pasos previos de la aplicación</w:t>
@@ -177,6 +177,7 @@
         <w:rPr>
           <w:noProof/>
         </w:rPr>
+        <w:lastRenderedPageBreak/>
         <w:drawing>
           <wp:inline distT="0" distB="0" distL="0" distR="0" wp14:anchorId="259CAD2F" wp14:editId="259CAD30">
             <wp:extent cx="3295650" cy="3000375"/>
@@ -228,35 +229,32 @@
         <w:jc w:val="both"/>
       </w:pPr>
       <w:r>
-        <w:rPr/>
         <w:t xml:space="preserve">Si al descargar la aplicación y al intentar ejecutarla arroja un error con la pantalla azul con este mensaje pop-up, deberán abrir un ticket en la mesa de ayuda para que se les habilite el uso de la aplicación. El ticket debe ser generado en la </w:t>
       </w:r>
       <w:r>
         <w:rPr>
-          <w:b w:val="1"/>
-          <w:bCs w:val="1"/>
+          <w:b/>
+          <w:bCs/>
         </w:rPr>
         <w:t>Categoría:</w:t>
       </w:r>
       <w:r>
-        <w:rPr/>
         <w:t xml:space="preserve"> Aplicaciones de escritorio y en la </w:t>
       </w:r>
       <w:r>
         <w:rPr>
-          <w:b w:val="1"/>
-          <w:bCs w:val="1"/>
+          <w:b/>
+          <w:bCs/>
         </w:rPr>
         <w:t>Subcategoría:</w:t>
       </w:r>
       <w:r>
-        <w:rPr/>
         <w:t xml:space="preserve"> Homologación de software. Con ese paso realizado el equipo de soporte les habilitará la aplicación y podrán acceder a todos los módulos de esta, los cuales están detallados más abajo.</w:t>
       </w:r>
     </w:p>
     <w:p>
       <w:pPr>
-        <w:pStyle w:val="Heading1"/>
+        <w:pStyle w:val="Ttulo1"/>
       </w:pPr>
       <w:r>
         <w:t>Entrando a la aplicación</w:t>
@@ -267,8 +265,7 @@
         <w:jc w:val="both"/>
       </w:pPr>
       <w:r>
-        <w:rPr/>
-        <w:t xml:space="preserve">Al ejecutar el “Auditor” se mostrará la siguiente pantalla. De inicio les aparecerá el módulo de Verificación de Sumas, de igual manera se puede observar el resto de módulos tales como Llenado de Comparativos, Flujo de Efectivo y Validar Comparativos. Más abajo se detalla su función y sus requisitos.</w:t>
+        <w:t>Al ejecutar el “Auditor” se mostrará la siguiente pantalla. De inicio les aparecerá el módulo de Verificación de Sumas, de igual manera se puede observar el resto de módulos tales como Llenado de Comparativos, Flujo de Efectivo y Validar Comparativos. Más abajo se detalla su función y sus requisitos.</w:t>
       </w:r>
     </w:p>
     <w:p>
@@ -277,7 +274,7 @@
         <w:spacing w:before="140" w:after="200" w:line="240" w:lineRule="auto"/>
         <w:jc w:val="center"/>
       </w:pPr>
-      <w:commentRangeStart w:id="20"/>
+      <w:commentRangeStart w:id="0"/>
       <w:r>
         <w:rPr>
           <w:noProof/>
@@ -332,14 +329,14 @@
           </wp:inline>
         </w:drawing>
       </w:r>
-      <w:commentRangeEnd w:id="20"/>
+      <w:commentRangeEnd w:id="0"/>
       <w:r>
         <w:rPr>
           <w:rStyle w:val="Refdecomentario"/>
           <w:sz w:val="22"/>
           <w:szCs w:val="22"/>
         </w:rPr>
-        <w:commentReference w:id="20"/>
+        <w:commentReference w:id="0"/>
       </w:r>
     </w:p>
     <w:p>
@@ -352,12 +349,12 @@
       <w:tblPr>
         <w:tblW w:w="9360" w:type="dxa"/>
         <w:tblBorders>
-          <w:top w:val="none" w:color="FFFFFF" w:sz="0" w:space="0"/>
-          <w:left w:val="none" w:color="FFFFFF" w:sz="0" w:space="0"/>
-          <w:bottom w:val="none" w:color="FFFFFF" w:sz="0" w:space="0"/>
-          <w:right w:val="none" w:color="FFFFFF" w:sz="0" w:space="0"/>
-          <w:insideH w:val="none" w:color="FFFFFF" w:sz="0" w:space="0"/>
-          <w:insideV w:val="none" w:color="FFFFFF" w:sz="0" w:space="0"/>
+          <w:top w:val="none" w:sz="0" w:space="0" w:color="FFFFFF"/>
+          <w:left w:val="none" w:sz="0" w:space="0" w:color="FFFFFF"/>
+          <w:bottom w:val="none" w:sz="0" w:space="0" w:color="FFFFFF"/>
+          <w:right w:val="none" w:sz="0" w:space="0" w:color="FFFFFF"/>
+          <w:insideH w:val="none" w:sz="0" w:space="0" w:color="FFFFFF"/>
+          <w:insideV w:val="none" w:sz="0" w:space="0" w:color="FFFFFF"/>
         </w:tblBorders>
         <w:tblCellMar>
           <w:left w:w="10" w:type="dxa"/>
@@ -476,8 +473,7 @@
         <w:jc w:val="both"/>
       </w:pPr>
       <w:r>
-        <w:rPr/>
-        <w:t xml:space="preserve">Accede a los documentos Word (docx) de los Estados Financieros directamente en Workiva y para un período dado revisa automáticamente todos los cuadros que contienen valores que los totales y sub-totales coincidan con la suma de sus componentes.</w:t>
+        <w:t>Accede a los documentos Word (docx) de los Estados Financieros directamente en Workiva y para un período dado revisa automáticamente todos los cuadros que contienen valores que los totales y sub-totales coincidan con la suma de sus componentes.</w:t>
       </w:r>
     </w:p>
     <w:p>
@@ -493,7 +489,7 @@
         <w:jc w:val="both"/>
       </w:pPr>
       <w:r>
-        <w:t xml:space="preserve">Además de sumar hacia abajo (que cada total cuadre con las filas que tiene encima), también revisa las sumas horizontales: los cuadros que tienen una columna "Total" a la derecha, que debe ser igual a la suma de las columnas de detalle en esa misma fila. Las celdas expresadas en porcentaje (por ejemplo 9 %, 84 %, 100 %) también se reconocen como cifras y se verifican igual que los montos.</w:t>
+        <w:t>Además de sumar hacia abajo (que cada total cuadre con las filas que tiene encima), también revisa las sumas horizontales: los cuadros que tienen una columna "Total" a la derecha, que debe ser igual a la suma de las columnas de detalle en esa misma fila. Las celdas expresadas en porcentaje (por ejemplo 9 %, 84 %, 100 %) también se reconocen como cifras y se verifican igual que los montos.</w:t>
       </w:r>
     </w:p>
     <w:p>
@@ -519,12 +515,12 @@
       <w:tblPr>
         <w:tblW w:w="9360" w:type="dxa"/>
         <w:tblBorders>
-          <w:top w:val="none" w:color="FFFFFF" w:sz="0" w:space="0"/>
-          <w:left w:val="single" w:color="2E74B5" w:sz="18" w:space="0"/>
-          <w:bottom w:val="none" w:color="FFFFFF" w:sz="0" w:space="0"/>
-          <w:right w:val="none" w:color="FFFFFF" w:sz="0" w:space="0"/>
-          <w:insideH w:val="none" w:color="FFFFFF" w:sz="0" w:space="0"/>
-          <w:insideV w:val="none" w:color="FFFFFF" w:sz="0" w:space="0"/>
+          <w:top w:val="none" w:sz="0" w:space="0" w:color="FFFFFF"/>
+          <w:left w:val="single" w:sz="18" w:space="0" w:color="2E74B5"/>
+          <w:bottom w:val="none" w:sz="0" w:space="0" w:color="FFFFFF"/>
+          <w:right w:val="none" w:sz="0" w:space="0" w:color="FFFFFF"/>
+          <w:insideH w:val="none" w:sz="0" w:space="0" w:color="FFFFFF"/>
+          <w:insideV w:val="none" w:sz="0" w:space="0" w:color="FFFFFF"/>
         </w:tblBorders>
         <w:tblCellMar>
           <w:left w:w="10" w:type="dxa"/>
@@ -556,7 +552,7 @@
             </w:pPr>
             <w:r>
               <w:rPr>
-                <w:rFonts w:ascii="Consolas" w:hAnsi="Consolas" w:eastAsia="Consolas" w:cs="Consolas"/>
+                <w:rFonts w:ascii="Consolas" w:eastAsia="Consolas" w:hAnsi="Consolas" w:cs="Consolas"/>
                 <w:color w:val="595959"/>
                 <w:sz w:val="19"/>
                 <w:szCs w:val="19"/>
@@ -565,7 +561,7 @@
             </w:r>
             <w:r>
               <w:rPr>
-                <w:rFonts w:ascii="Consolas" w:hAnsi="Consolas" w:eastAsia="Consolas" w:cs="Consolas"/>
+                <w:rFonts w:ascii="Consolas" w:eastAsia="Consolas" w:hAnsi="Consolas" w:cs="Consolas"/>
                 <w:b/>
                 <w:bCs/>
                 <w:color w:val="12385F"/>
@@ -581,7 +577,7 @@
             </w:pPr>
             <w:r>
               <w:rPr>
-                <w:rFonts w:ascii="Consolas" w:hAnsi="Consolas" w:eastAsia="Consolas" w:cs="Consolas"/>
+                <w:rFonts w:ascii="Consolas" w:eastAsia="Consolas" w:hAnsi="Consolas" w:cs="Consolas"/>
                 <w:color w:val="595959"/>
                 <w:sz w:val="19"/>
                 <w:szCs w:val="19"/>
@@ -590,7 +586,7 @@
             </w:r>
             <w:r>
               <w:rPr>
-                <w:rFonts w:ascii="Consolas" w:hAnsi="Consolas" w:eastAsia="Consolas" w:cs="Consolas"/>
+                <w:rFonts w:ascii="Consolas" w:eastAsia="Consolas" w:hAnsi="Consolas" w:cs="Consolas"/>
                 <w:b/>
                 <w:bCs/>
                 <w:color w:val="12385F"/>
@@ -785,6 +781,7 @@
         <w:rPr>
           <w:noProof/>
         </w:rPr>
+        <w:lastRenderedPageBreak/>
         <w:drawing>
           <wp:inline distT="0" distB="0" distL="0" distR="0" wp14:anchorId="259CAD35" wp14:editId="259CAD36">
             <wp:extent cx="4933950" cy="2581275"/>
@@ -876,13 +873,13 @@
         <w:spacing w:before="140" w:after="200" w:line="240" w:lineRule="auto"/>
         <w:jc w:val="center"/>
       </w:pPr>
-      <w:commentRangeStart w:id="27"/>
+      <w:commentRangeStart w:id="2"/>
       <w:r>
         <w:rPr>
           <w:noProof/>
         </w:rPr>
         <w:drawing>
-          <wp:inline distT="0" distB="0" distL="0" distR="0" wp14:anchorId="259CAD37" wp14:editId="5E5776A0">
+          <wp:inline distT="0" distB="0" distL="0" distR="0" wp14:anchorId="259CAD37" wp14:editId="1048BD19">
             <wp:extent cx="6189294" cy="2501900"/>
             <wp:effectExtent l="0" t="0" r="2540" b="0"/>
             <wp:docPr id="1119918371" name="Imagen 1119918371">
@@ -931,14 +928,14 @@
           </wp:inline>
         </w:drawing>
       </w:r>
-      <w:commentRangeEnd w:id="27"/>
+      <w:commentRangeEnd w:id="2"/>
       <w:r>
         <w:rPr>
           <w:rStyle w:val="Refdecomentario"/>
           <w:sz w:val="22"/>
           <w:szCs w:val="22"/>
         </w:rPr>
-        <w:commentReference w:id="27"/>
+        <w:commentReference w:id="2"/>
       </w:r>
     </w:p>
     <w:p>
@@ -964,6 +961,7 @@
         <w:rPr>
           <w:noProof/>
         </w:rPr>
+        <w:lastRenderedPageBreak/>
         <w:drawing>
           <wp:inline distT="0" distB="0" distL="0" distR="0" wp14:anchorId="259CAD39" wp14:editId="367897BC">
             <wp:extent cx="4757676" cy="2266950"/>
@@ -1039,7 +1037,7 @@
           <w:noProof/>
         </w:rPr>
         <w:drawing>
-          <wp:inline distT="0" distB="0" distL="0" distR="0" wp14:anchorId="259CAD3B" wp14:editId="510A0051">
+          <wp:inline distT="0" distB="0" distL="0" distR="0" wp14:anchorId="259CAD3B" wp14:editId="7AF47C12">
             <wp:extent cx="4933950" cy="2249247"/>
             <wp:effectExtent l="0" t="0" r="0" b="0"/>
             <wp:docPr id="410004366" name="Imagen 410004366">
@@ -1099,12 +1097,12 @@
       <w:tblPr>
         <w:tblW w:w="9360" w:type="dxa"/>
         <w:tblBorders>
-          <w:top w:val="none" w:color="FFFFFF" w:sz="0" w:space="0"/>
-          <w:left w:val="none" w:color="FFFFFF" w:sz="0" w:space="0"/>
-          <w:bottom w:val="none" w:color="FFFFFF" w:sz="0" w:space="0"/>
-          <w:right w:val="none" w:color="FFFFFF" w:sz="0" w:space="0"/>
-          <w:insideH w:val="none" w:color="FFFFFF" w:sz="0" w:space="0"/>
-          <w:insideV w:val="none" w:color="FFFFFF" w:sz="0" w:space="0"/>
+          <w:top w:val="none" w:sz="0" w:space="0" w:color="FFFFFF"/>
+          <w:left w:val="none" w:sz="0" w:space="0" w:color="FFFFFF"/>
+          <w:bottom w:val="none" w:sz="0" w:space="0" w:color="FFFFFF"/>
+          <w:right w:val="none" w:sz="0" w:space="0" w:color="FFFFFF"/>
+          <w:insideH w:val="none" w:sz="0" w:space="0" w:color="FFFFFF"/>
+          <w:insideV w:val="none" w:sz="0" w:space="0" w:color="FFFFFF"/>
         </w:tblBorders>
         <w:tblCellMar>
           <w:left w:w="10" w:type="dxa"/>
@@ -1280,8 +1278,7 @@
         <w:jc w:val="both"/>
       </w:pPr>
       <w:r>
-        <w:rPr/>
-        <w:t xml:space="preserve">Solo escribe números, solo en celdas vacías y siempre que el archivo y las celdas de destino no estén bloqueadas para escritura. Si la celda destino tiene una fórmula, como una suma o un subtotal, no la toca. Si tiene texto, tampoco. Y si la fila no tiene nombre ni código, la salta.</w:t>
+        <w:t>Solo escribe números, solo en celdas vacías y siempre que el archivo y las celdas de destino no estén bloqueadas para escritura. Si la celda destino tiene una fórmula, como una suma o un subtotal, no la toca. Si tiene texto, tampoco. Y si la fila no tiene nombre ni código, la salta.</w:t>
       </w:r>
     </w:p>
     <w:p>
@@ -1418,6 +1415,7 @@
         <w:jc w:val="both"/>
       </w:pPr>
       <w:r>
+        <w:lastRenderedPageBreak/>
         <w:t>Haz clic en "Buscar archivos". La aplicación buscará en Workiva todos los archivos “Excel” individuales del período.</w:t>
       </w:r>
     </w:p>
@@ -1595,6 +1593,7 @@
         <w:rPr>
           <w:noProof/>
         </w:rPr>
+        <w:lastRenderedPageBreak/>
         <w:drawing>
           <wp:inline distT="0" distB="0" distL="0" distR="0" wp14:anchorId="259CAD41" wp14:editId="1F72246F">
             <wp:extent cx="3733800" cy="1980620"/>
@@ -1818,6 +1817,7 @@
         <w:rPr>
           <w:spacing w:val="24"/>
         </w:rPr>
+        <w:lastRenderedPageBreak/>
         <w:t>REGLAS AUTOMÁTICAS APLICADAS</w:t>
       </w:r>
     </w:p>
@@ -1867,12 +1867,12 @@
       <w:tblPr>
         <w:tblW w:w="9360" w:type="dxa"/>
         <w:tblBorders>
-          <w:top w:val="none" w:color="FFFFFF" w:sz="0" w:space="0"/>
-          <w:left w:val="none" w:color="FFFFFF" w:sz="0" w:space="0"/>
-          <w:bottom w:val="none" w:color="FFFFFF" w:sz="0" w:space="0"/>
-          <w:right w:val="none" w:color="FFFFFF" w:sz="0" w:space="0"/>
-          <w:insideH w:val="none" w:color="FFFFFF" w:sz="0" w:space="0"/>
-          <w:insideV w:val="none" w:color="FFFFFF" w:sz="0" w:space="0"/>
+          <w:top w:val="none" w:sz="0" w:space="0" w:color="FFFFFF"/>
+          <w:left w:val="none" w:sz="0" w:space="0" w:color="FFFFFF"/>
+          <w:bottom w:val="none" w:sz="0" w:space="0" w:color="FFFFFF"/>
+          <w:right w:val="none" w:sz="0" w:space="0" w:color="FFFFFF"/>
+          <w:insideH w:val="none" w:sz="0" w:space="0" w:color="FFFFFF"/>
+          <w:insideV w:val="none" w:sz="0" w:space="0" w:color="FFFFFF"/>
         </w:tblBorders>
         <w:tblCellMar>
           <w:left w:w="10" w:type="dxa"/>
@@ -2268,7 +2268,8 @@
         <w:jc w:val="both"/>
       </w:pPr>
       <w:r>
-        <w:t xml:space="preserve">El archivo generado nunca reemplaza a uno anterior: si ya existe un flujo de ese mismo período en la carpeta, el nuevo se guarda sumando un número al nombre (Flujo_Efectivo_06-2026 (2).xlsx, (3), y así sucesivamente), igual que cuando se descarga varias veces un mismo archivo desde el navegador. El panel de Actividad indica con qué nombre quedó guardado.</w:t>
+        <w:lastRenderedPageBreak/>
+        <w:t>El archivo generado nunca reemplaza a uno anterior: si ya existe un flujo de ese mismo período en la carpeta, el nuevo se guarda sumando un número al nombre (Flujo_Efectivo_06-2026 (2).xlsx, (3), y así sucesivamente), igual que cuando se descarga varias veces un mismo archivo desde el navegador. El panel de Actividad indica con qué nombre quedó guardado.</w:t>
       </w:r>
     </w:p>
     <w:p>
@@ -2337,12 +2338,12 @@
       <w:tblPr>
         <w:tblW w:w="9360" w:type="dxa"/>
         <w:tblBorders>
-          <w:top w:val="none" w:color="FFFFFF" w:sz="0" w:space="0"/>
-          <w:left w:val="none" w:color="FFFFFF" w:sz="0" w:space="0"/>
-          <w:bottom w:val="none" w:color="FFFFFF" w:sz="0" w:space="0"/>
-          <w:right w:val="none" w:color="FFFFFF" w:sz="0" w:space="0"/>
-          <w:insideH w:val="none" w:color="FFFFFF" w:sz="0" w:space="0"/>
-          <w:insideV w:val="none" w:color="FFFFFF" w:sz="0" w:space="0"/>
+          <w:top w:val="none" w:sz="0" w:space="0" w:color="FFFFFF"/>
+          <w:left w:val="none" w:sz="0" w:space="0" w:color="FFFFFF"/>
+          <w:bottom w:val="none" w:sz="0" w:space="0" w:color="FFFFFF"/>
+          <w:right w:val="none" w:sz="0" w:space="0" w:color="FFFFFF"/>
+          <w:insideH w:val="none" w:sz="0" w:space="0" w:color="FFFFFF"/>
+          <w:insideV w:val="none" w:sz="0" w:space="0" w:color="FFFFFF"/>
         </w:tblBorders>
         <w:tblCellMar>
           <w:left w:w="10" w:type="dxa"/>
@@ -2670,6 +2671,7 @@
         <w:rPr>
           <w:noProof/>
         </w:rPr>
+        <w:lastRenderedPageBreak/>
         <w:drawing>
           <wp:inline distT="0" distB="0" distL="0" distR="0" wp14:anchorId="259CAD4D" wp14:editId="259CAD4E">
             <wp:extent cx="4933950" cy="2657475"/>
@@ -2739,7 +2741,7 @@
         <w:jc w:val="both"/>
       </w:pPr>
       <w:r>
-        <w:t xml:space="preserve">Si necesitas cortar una validación en curso, presiona "Detener" (aparece arriba a la derecha del panel de Actividad mientras el proceso corre). Termina el lote de hojas que esté procesando y genera igual el Excel con lo revisado hasta ese punto, para no dejar el reporte a medias.</w:t>
+        <w:t>Si necesitas cortar una validación en curso, presiona "Detener" (aparece arriba a la derecha del panel de Actividad mientras el proceso corre). Termina el lote de hojas que esté procesando y genera igual el Excel con lo revisado hasta ese punto, para no dejar el reporte a medias.</w:t>
       </w:r>
     </w:p>
     <w:p>
@@ -2829,7 +2831,7 @@
         <w:jc w:val="both"/>
       </w:pPr>
       <w:r>
-        <w:t xml:space="preserve">Cada vez que presionas "Validar" el panel de Actividad se limpia solo, de modo que siempre muestre únicamente la corrida en curso y no se acumule el texto de las sociedades validadas antes.</w:t>
+        <w:t>Cada vez que presionas "Validar" el panel de Actividad se limpia solo, de modo que siempre muestre únicamente la corrida en curso y no se acumule el texto de las sociedades validadas antes.</w:t>
       </w:r>
     </w:p>
     <w:p>
@@ -2837,11 +2839,15 @@
         <w:keepLines/>
         <w:spacing w:before="140" w:after="200" w:line="240" w:lineRule="auto"/>
         <w:jc w:val="center"/>
+        <w:rPr>
+          <w:ins w:id="4" w:author="Emerson Garrido Villarroel" w:date="2026-08-21T09:34:00Z" w16du:dateUtc="2026-08-21T13:34:00Z"/>
+        </w:rPr>
       </w:pPr>
       <w:r>
         <w:rPr>
           <w:noProof/>
         </w:rPr>
+        <w:lastRenderedPageBreak/>
         <w:drawing>
           <wp:inline distT="0" distB="0" distL="0" distR="0" wp14:anchorId="259CAD51" wp14:editId="02005F2A">
             <wp:extent cx="4876800" cy="1540878"/>
@@ -2890,10 +2896,17 @@
     </w:p>
     <w:p>
       <w:pPr>
+        <w:keepLines/>
+        <w:spacing w:before="140" w:after="200" w:line="240" w:lineRule="auto"/>
+        <w:jc w:val="center"/>
+      </w:pPr>
+    </w:p>
+    <w:p>
+      <w:pPr>
         <w:pStyle w:val="TituloModulo"/>
       </w:pPr>
       <w:r>
-        <w:t xml:space="preserve">Crear Período</w:t>
+        <w:t>Crear Período</w:t>
       </w:r>
     </w:p>
     <w:p>
@@ -2904,31 +2917,62 @@
         <w:rPr>
           <w:spacing w:val="24"/>
         </w:rPr>
-        <w:t xml:space="preserve">QUÉ HACE</w:t>
-      </w:r>
-    </w:p>
-    <w:p>
-      <w:pPr>
-        <w:jc w:val="both"/>
-      </w:pPr>
-      <w:r>
-        <w:t xml:space="preserve">Crea la carpeta de un período nuevo dentro de Workiva usando la del período anterior como base. Para el usuario el resultado es un período nuevo listo para trabajar; por dentro se resuelve copiando la carpeta anterior completa, con sus archivos, sus links y sus conexiones.</w:t>
-      </w:r>
-    </w:p>
-    <w:p>
-      <w:pPr>
-        <w:jc w:val="both"/>
-      </w:pPr>
-      <w:r>
-        <w:t xml:space="preserve">El período que se toma como base no es siempre el mes anterior. Los meses de cierre trimestral (03, 06, 09 y 12) se crean a partir del trimestre anterior: septiembre se crea desde junio y diciembre desde septiembre. El resto de los meses se crean a partir del mes anterior, pero saltándose los cierres trimestrales, porque un cierre tiene una estructura distinta y no sirve de base para un mes normal: agosto se crea desde julio, pero enero se crea desde noviembre (no desde diciembre) y abril desde febrero (no desde marzo).</w:t>
-      </w:r>
-    </w:p>
-    <w:p>
-      <w:pPr>
-        <w:jc w:val="both"/>
-      </w:pPr>
-      <w:r>
-        <w:t xml:space="preserve">Una vez copiada la carpeta, el módulo hace tres cosas más de forma automática. Renombra cada archivo cambiando el período en su nombre (por ejemplo E200_IND_07-2026_Base Notas CGE pasa a E200_IND_08-2026_Base Notas CGE) y le quita el sufijo "(1)" que Workiva agrega al copiar. Actualiza el parámetro TIME de las conexiones de datos de cada planilla (la hoja Query BPC en los Individuales, y su equivalente en los Consolidados) para que apunten al período nuevo. Y mantiene los links hacia los archivos fuente originales en vez de duplicarlos, que es lo que evita que la copia se dispare de una hora a varios días. Los outline labels y las automations se conservan.</w:t>
+        <w:t>QUÉ HACE</w:t>
+      </w:r>
+    </w:p>
+    <w:p>
+      <w:pPr>
+        <w:jc w:val="both"/>
+      </w:pPr>
+      <w:r>
+        <w:t>Crea la carpeta de un período nuevo dentro de Workiva usando la del período anterior como base. Para el usuario el resultado es un período nuevo listo para trabajar; por dentro se resuelve copiando la carpeta anterior completa, con sus archivos, sus links y sus conexiones.</w:t>
+      </w:r>
+    </w:p>
+    <w:p>
+      <w:pPr>
+        <w:jc w:val="both"/>
+      </w:pPr>
+      <w:r>
+        <w:t xml:space="preserve">El período que se toma como base no es siempre el mes anterior. Los meses de cierre trimestral (03, 06, 09 y 12) se crean a partir del trimestre anterior: septiembre se crea desde junio y diciembre desde septiembre. El resto de los meses se crean a partir del mes anterior, pero saltándose los cierres trimestrales, porque un cierre tiene una estructura distinta y no sirve de base para un mes normal: agosto se crea desde julio, pero enero se crea desde noviembre (no desde diciembre) y abril desde </w:t>
+      </w:r>
+      <w:r>
+        <w:t>febrero</w:t>
+      </w:r>
+      <w:r>
+        <w:t xml:space="preserve"> (no desde marzo).</w:t>
+      </w:r>
+    </w:p>
+    <w:p>
+      <w:pPr>
+        <w:jc w:val="both"/>
+        <w:rPr>
+          <w:del w:id="5" w:author="Emerson Garrido Villarroel" w:date="2026-08-21T09:45:00Z" w16du:dateUtc="2026-08-21T13:45:00Z"/>
+        </w:rPr>
+      </w:pPr>
+      <w:r>
+        <w:t xml:space="preserve">Una vez copiada la carpeta, el módulo hace </w:t>
+      </w:r>
+      <w:r>
+        <w:rPr>
+          <w:b/>
+          <w:bCs/>
+        </w:rPr>
+        <w:t>tres</w:t>
+      </w:r>
+      <w:r>
+        <w:t xml:space="preserve"> cosas más de forma automática. Renombra cada archivo cambiando el período en su nombre (por ejemplo E200_IND_07-2026_Base Notas CGE pasa a E200_IND_08-2026_Base Notas CGE). Actualiza el parámetro TIME de las conexiones de datos de cada planilla (la hoja Query BPC en los Individuales, y su equivalente en los Consolidados) para que apunten al período nuevo. L</w:t>
+      </w:r>
+      <w:r>
+        <w:t>as etiquetas</w:t>
+      </w:r>
+      <w:r>
+        <w:t xml:space="preserve"> y las automations </w:t>
+      </w:r>
+      <w:r>
+        <w:t xml:space="preserve">relacionadas a ellas </w:t>
+      </w:r>
+      <w:r>
+        <w:t>se conservan.</w:t>
       </w:r>
     </w:p>
     <w:p>
@@ -2939,14 +2983,14 @@
         <w:rPr>
           <w:spacing w:val="24"/>
         </w:rPr>
-        <w:t xml:space="preserve">CAMPOS DE ENTRADA</w:t>
-      </w:r>
-    </w:p>
-    <w:p>
-      <w:pPr>
-        <w:numPr>
-          <w:ilvl w:val="0"/>
-          <w:numId w:val="20"/>
+        <w:t>CAMPOS DE ENTRADA</w:t>
+      </w:r>
+    </w:p>
+    <w:p>
+      <w:pPr>
+        <w:numPr>
+          <w:ilvl w:val="0"/>
+          <w:numId w:val="9"/>
         </w:numPr>
         <w:spacing w:after="50" w:line="264" w:lineRule="auto"/>
         <w:jc w:val="both"/>
@@ -2956,14 +3000,14 @@
           <w:sz w:val="21"/>
           <w:szCs w:val="21"/>
         </w:rPr>
-        <w:t xml:space="preserve">Mes del período que se quiere crear</w:t>
-      </w:r>
-    </w:p>
-    <w:p>
-      <w:pPr>
-        <w:numPr>
-          <w:ilvl w:val="0"/>
-          <w:numId w:val="20"/>
+        <w:t>Mes del período que se quiere crear</w:t>
+      </w:r>
+    </w:p>
+    <w:p>
+      <w:pPr>
+        <w:numPr>
+          <w:ilvl w:val="0"/>
+          <w:numId w:val="9"/>
         </w:numPr>
         <w:spacing w:after="50" w:line="264" w:lineRule="auto"/>
         <w:jc w:val="both"/>
@@ -2973,7 +3017,7 @@
           <w:sz w:val="21"/>
           <w:szCs w:val="21"/>
         </w:rPr>
-        <w:t xml:space="preserve">Año del período que se quiere crear</w:t>
+        <w:t>Año del período que se quiere crear</w:t>
       </w:r>
     </w:p>
     <w:p>
@@ -2984,14 +3028,14 @@
         <w:rPr>
           <w:spacing w:val="24"/>
         </w:rPr>
-        <w:t xml:space="preserve">CONDICIONES NECESARIAS</w:t>
-      </w:r>
-    </w:p>
-    <w:p>
-      <w:pPr>
-        <w:numPr>
-          <w:ilvl w:val="0"/>
-          <w:numId w:val="21"/>
+        <w:t>CONDICIONES NECESARIAS</w:t>
+      </w:r>
+    </w:p>
+    <w:p>
+      <w:pPr>
+        <w:numPr>
+          <w:ilvl w:val="0"/>
+          <w:numId w:val="10"/>
         </w:numPr>
         <w:spacing w:after="50" w:line="264" w:lineRule="auto"/>
         <w:jc w:val="both"/>
@@ -3001,48 +3045,30 @@
           <w:sz w:val="21"/>
           <w:szCs w:val="21"/>
         </w:rPr>
-        <w:t xml:space="preserve">Que exista la carpeta del año de destino dentro de "Estados Financieros". La aplicación no crea carpetas de año: si vas a crear enero de un año nuevo, primero hay que crear a mano la carpeta de ese año.</w:t>
-      </w:r>
-    </w:p>
-    <w:p>
-      <w:pPr>
-        <w:numPr>
-          <w:ilvl w:val="0"/>
-          <w:numId w:val="21"/>
-        </w:numPr>
-        <w:spacing w:after="50" w:line="264" w:lineRule="auto"/>
-        <w:jc w:val="both"/>
-      </w:pPr>
-      <w:r>
-        <w:rPr>
+        <w:t>Que exista la carpeta del año de destino dentro de "Estados Financieros</w:t>
+      </w:r>
+      <w:r>
+        <w:rPr>
+          <w:b/>
+          <w:bCs/>
           <w:sz w:val="21"/>
           <w:szCs w:val="21"/>
         </w:rPr>
-        <w:t xml:space="preserve">Que exista la carpeta del período de origen que corresponde según la regla.</w:t>
-      </w:r>
-    </w:p>
-    <w:p>
-      <w:pPr>
-        <w:numPr>
-          <w:ilvl w:val="0"/>
-          <w:numId w:val="21"/>
-        </w:numPr>
-        <w:spacing w:after="50" w:line="264" w:lineRule="auto"/>
-        <w:jc w:val="both"/>
-      </w:pPr>
+        <w:t>". La aplicación no crea carpetas de año</w:t>
+      </w:r>
       <w:r>
         <w:rPr>
           <w:sz w:val="21"/>
           <w:szCs w:val="21"/>
         </w:rPr>
-        <w:t xml:space="preserve">Que NO exista todavía la carpeta del período que se quiere crear.</w:t>
-      </w:r>
-    </w:p>
-    <w:p>
-      <w:pPr>
-        <w:numPr>
-          <w:ilvl w:val="0"/>
-          <w:numId w:val="21"/>
+        <w:t>: si vas a crear enero de un año nuevo, primero hay que crear a mano la carpeta de ese año.</w:t>
+      </w:r>
+    </w:p>
+    <w:p>
+      <w:pPr>
+        <w:numPr>
+          <w:ilvl w:val="0"/>
+          <w:numId w:val="10"/>
         </w:numPr>
         <w:spacing w:after="50" w:line="264" w:lineRule="auto"/>
         <w:jc w:val="both"/>
@@ -3052,101 +3078,14 @@
           <w:sz w:val="21"/>
           <w:szCs w:val="21"/>
         </w:rPr>
-        <w:t xml:space="preserve">Tener permisos de propietario (owner) sobre la carpeta que se va a copiar.</w:t>
-      </w:r>
-    </w:p>
-    <w:p>
-      <w:pPr>
-        <w:pStyle w:val="Etiqueta"/>
-      </w:pPr>
-      <w:r>
-        <w:rPr>
-          <w:spacing w:val="24"/>
-        </w:rPr>
-        <w:t xml:space="preserve">PASOS DE USO</w:t>
-      </w:r>
-    </w:p>
-    <w:p>
-      <w:pPr>
-        <w:numPr>
-          <w:ilvl w:val="0"/>
-          <w:numId w:val="22"/>
-        </w:numPr>
-        <w:spacing w:after="90"/>
-        <w:jc w:val="both"/>
-      </w:pPr>
-      <w:r>
-        <w:t xml:space="preserve">Escribe el Mes y el Año del período que quieres crear (ej: 08 y 2026).</w:t>
-      </w:r>
-    </w:p>
-    <w:p>
-      <w:pPr>
-        <w:numPr>
-          <w:ilvl w:val="0"/>
-          <w:numId w:val="22"/>
-        </w:numPr>
-        <w:spacing w:after="90"/>
-        <w:jc w:val="both"/>
-      </w:pPr>
-      <w:r>
-        <w:t xml:space="preserve">Revisa el recuadro "SE VA A CREAR A PARTIR DE": muestra desde qué período se va a copiar y con qué regla (mensual o trimestral). Verifica que sea el correcto antes de seguir.</w:t>
-      </w:r>
-    </w:p>
-    <w:p>
-      <w:pPr>
-        <w:numPr>
-          <w:ilvl w:val="0"/>
-          <w:numId w:val="22"/>
-        </w:numPr>
-        <w:spacing w:after="90"/>
-        <w:jc w:val="both"/>
-      </w:pPr>
-      <w:r>
-        <w:t xml:space="preserve">Presiona "Crear período". Saldrá una alerta de confirmación con el detalle de lo que se va a hacer; es una medida de prevención, porque la copia no se puede cancelar una vez iniciada en Workiva.</w:t>
-      </w:r>
-    </w:p>
-    <w:p>
-      <w:pPr>
-        <w:numPr>
-          <w:ilvl w:val="0"/>
-          <w:numId w:val="22"/>
-        </w:numPr>
-        <w:spacing w:after="90"/>
-        <w:jc w:val="both"/>
-      </w:pPr>
-      <w:r>
-        <w:t xml:space="preserve">Confirma. El panel de Actividad muestra el avance: primero la copia de la carpeta, después el renombrado archivo por archivo y la actualización de las conexiones.</w:t>
-      </w:r>
-    </w:p>
-    <w:p>
-      <w:pPr>
-        <w:numPr>
-          <w:ilvl w:val="0"/>
-          <w:numId w:val="22"/>
-        </w:numPr>
-        <w:spacing w:after="90"/>
-        <w:jc w:val="both"/>
-      </w:pPr>
-      <w:r>
-        <w:t xml:space="preserve">Al terminar aparece un mensaje con el resumen: cuántos archivos se renombraron y cuántas conexiones se actualizaron. Los archivos que no calzaron con el patrón de nombre esperado quedan listados en el panel de Actividad para revisarlos manualmente.</w:t>
-      </w:r>
-    </w:p>
-    <w:p>
-      <w:pPr>
-        <w:pStyle w:val="Etiqueta"/>
-      </w:pPr>
-      <w:r>
-        <w:rPr>
-          <w:spacing w:val="24"/>
-        </w:rPr>
-        <w:t xml:space="preserve">A TENER EN CUENTA</w:t>
-      </w:r>
-    </w:p>
-    <w:p>
-      <w:pPr>
-        <w:numPr>
-          <w:ilvl w:val="0"/>
-          <w:numId w:val="21"/>
+        <w:t>Que exista la carpeta del período de origen que corresponde según la regla.</w:t>
+      </w:r>
+    </w:p>
+    <w:p>
+      <w:pPr>
+        <w:numPr>
+          <w:ilvl w:val="0"/>
+          <w:numId w:val="10"/>
         </w:numPr>
         <w:spacing w:after="50" w:line="264" w:lineRule="auto"/>
         <w:jc w:val="both"/>
@@ -3156,14 +3095,14 @@
           <w:sz w:val="21"/>
           <w:szCs w:val="21"/>
         </w:rPr>
-        <w:t xml:space="preserve">La copia puede tardar bastante (del orden de una hora, según el tamaño del período) y corre del lado de Workiva: cerrar la aplicación no la detiene.</w:t>
-      </w:r>
-    </w:p>
-    <w:p>
-      <w:pPr>
-        <w:numPr>
-          <w:ilvl w:val="0"/>
-          <w:numId w:val="21"/>
+        <w:t>Que NO exista todavía la carpeta del período que se quiere crear.</w:t>
+      </w:r>
+    </w:p>
+    <w:p>
+      <w:pPr>
+        <w:numPr>
+          <w:ilvl w:val="0"/>
+          <w:numId w:val="10"/>
         </w:numPr>
         <w:spacing w:after="50" w:line="264" w:lineRule="auto"/>
         <w:jc w:val="both"/>
@@ -3173,14 +3112,102 @@
           <w:sz w:val="21"/>
           <w:szCs w:val="21"/>
         </w:rPr>
-        <w:t xml:space="preserve">Si la carpeta del período de destino ya existe, el módulo se detiene y avisa sin copiar nada, para no mezclar ni sobrescribir archivos.</w:t>
-      </w:r>
-    </w:p>
-    <w:p>
-      <w:pPr>
-        <w:numPr>
-          <w:ilvl w:val="0"/>
-          <w:numId w:val="21"/>
+        <w:t>Tener permisos de propietario (owner) sobre la carpeta que se va a copiar.</w:t>
+      </w:r>
+    </w:p>
+    <w:p>
+      <w:pPr>
+        <w:pStyle w:val="Etiqueta"/>
+      </w:pPr>
+      <w:r>
+        <w:rPr>
+          <w:spacing w:val="24"/>
+        </w:rPr>
+        <w:t>PASOS DE USO</w:t>
+      </w:r>
+    </w:p>
+    <w:p>
+      <w:pPr>
+        <w:numPr>
+          <w:ilvl w:val="0"/>
+          <w:numId w:val="11"/>
+        </w:numPr>
+        <w:spacing w:after="90"/>
+        <w:jc w:val="both"/>
+      </w:pPr>
+      <w:r>
+        <w:t>Escribe el Mes y el Año del período que quieres crear (ej: 08 y 2026).</w:t>
+      </w:r>
+    </w:p>
+    <w:p>
+      <w:pPr>
+        <w:numPr>
+          <w:ilvl w:val="0"/>
+          <w:numId w:val="11"/>
+        </w:numPr>
+        <w:spacing w:after="90"/>
+        <w:jc w:val="both"/>
+      </w:pPr>
+      <w:r>
+        <w:lastRenderedPageBreak/>
+        <w:t>Revisa el recuadro "SE VA A CREAR A PARTIR DE": muestra desde qué período se va a copiar y con qué regla (mensual o trimestral). Verifica que sea el correcto antes de seguir.</w:t>
+      </w:r>
+    </w:p>
+    <w:p>
+      <w:pPr>
+        <w:numPr>
+          <w:ilvl w:val="0"/>
+          <w:numId w:val="11"/>
+        </w:numPr>
+        <w:spacing w:after="90"/>
+        <w:jc w:val="both"/>
+      </w:pPr>
+      <w:r>
+        <w:t>Presiona "Crear período". Saldrá una alerta de confirmación con el detalle de lo que se va a hacer; es una medida de prevención, porque la copia no se puede cancelar una vez iniciada en Workiva.</w:t>
+      </w:r>
+    </w:p>
+    <w:p>
+      <w:pPr>
+        <w:numPr>
+          <w:ilvl w:val="0"/>
+          <w:numId w:val="11"/>
+        </w:numPr>
+        <w:spacing w:after="90"/>
+        <w:jc w:val="both"/>
+      </w:pPr>
+      <w:r>
+        <w:t>Confirma. El panel de Actividad muestra el avance: primero la copia de la carpeta, después el renombrado archivo por archivo y la actualización de las conexiones.</w:t>
+      </w:r>
+    </w:p>
+    <w:p>
+      <w:pPr>
+        <w:numPr>
+          <w:ilvl w:val="0"/>
+          <w:numId w:val="11"/>
+        </w:numPr>
+        <w:spacing w:after="90"/>
+        <w:jc w:val="both"/>
+      </w:pPr>
+      <w:r>
+        <w:t>Al terminar aparece un mensaje con el resumen: cuántos archivos se renombraron y cuántas conexiones se actualizaron. Los archivos que no calzaron con el patrón de nombre esperado quedan listados en el panel de Actividad para revisarlos manualmente.</w:t>
+      </w:r>
+    </w:p>
+    <w:p>
+      <w:pPr>
+        <w:pStyle w:val="Etiqueta"/>
+      </w:pPr>
+      <w:r>
+        <w:rPr>
+          <w:spacing w:val="24"/>
+        </w:rPr>
+        <w:t>A TENER EN CUENTA</w:t>
+      </w:r>
+    </w:p>
+    <w:p>
+      <w:pPr>
+        <w:numPr>
+          <w:ilvl w:val="0"/>
+          <w:numId w:val="10"/>
         </w:numPr>
         <w:spacing w:after="50" w:line="264" w:lineRule="auto"/>
         <w:jc w:val="both"/>
@@ -3190,68 +3217,14 @@
           <w:sz w:val="21"/>
           <w:szCs w:val="21"/>
         </w:rPr>
-        <w:t xml:space="preserve">Los nombres de los archivos se ajustan solos, pero conviene revisarlos al terminar junto con los que el panel haya marcado como no renombrados.</w:t>
-      </w:r>
-    </w:p>
-    <w:p>
-      <w:pPr>
-        <w:pStyle w:val="TituloModulo"/>
-      </w:pPr>
-      <w:r>
-        <w:t xml:space="preserve">Publicar Linking</w:t>
-      </w:r>
-    </w:p>
-    <w:p>
-      <w:pPr>
-        <w:pStyle w:val="Etiqueta"/>
-      </w:pPr>
-      <w:r>
-        <w:rPr>
-          <w:spacing w:val="24"/>
-        </w:rPr>
-        <w:t xml:space="preserve">QUÉ HACE</w:t>
-      </w:r>
-    </w:p>
-    <w:p>
-      <w:pPr>
-        <w:jc w:val="both"/>
-      </w:pPr>
-      <w:r>
-        <w:t xml:space="preserve">Publica de una sola vez todos los links de todos los documentos de un período, sin tener que abrir archivo por archivo y presionar "Publish" en cada uno.</w:t>
-      </w:r>
-    </w:p>
-    <w:p>
-      <w:pPr>
-        <w:jc w:val="both"/>
-      </w:pPr>
-      <w:r>
-        <w:t xml:space="preserve">En Workiva un link tiene dos lados: el link fuente, que está en el archivo donde vive el dato original, y el link destino, que es donde ese dato se muestra. Cuando el valor cambia en el origen, el destino no se actualiza solo: hay que publicar. Publicar es exactamente eso, hacer que todos los links fuente de un archivo manden su valor actualizado a sus destinos.</w:t>
-      </w:r>
-    </w:p>
-    <w:p>
-      <w:pPr>
-        <w:jc w:val="both"/>
-      </w:pPr>
-      <w:r>
-        <w:t xml:space="preserve">El módulo recorre la carpeta del período completa, incluyendo los archivos que estén dentro de subcarpetas, y publica todos los links de cada archivo, no solamente los que editó el usuario que ejecuta la aplicación.</w:t>
-      </w:r>
-    </w:p>
-    <w:p>
-      <w:pPr>
-        <w:pStyle w:val="Etiqueta"/>
-      </w:pPr>
-      <w:r>
-        <w:rPr>
-          <w:spacing w:val="24"/>
-        </w:rPr>
-        <w:t xml:space="preserve">CAMPOS DE ENTRADA</w:t>
-      </w:r>
-    </w:p>
-    <w:p>
-      <w:pPr>
-        <w:numPr>
-          <w:ilvl w:val="0"/>
-          <w:numId w:val="23"/>
+        <w:t>La copia puede tardar bastante (del orden de una hora, según el tamaño del período) y corre del lado de Workiva: cerrar la aplicación no la detiene.</w:t>
+      </w:r>
+    </w:p>
+    <w:p>
+      <w:pPr>
+        <w:numPr>
+          <w:ilvl w:val="0"/>
+          <w:numId w:val="10"/>
         </w:numPr>
         <w:spacing w:after="50" w:line="264" w:lineRule="auto"/>
         <w:jc w:val="both"/>
@@ -3261,14 +3234,14 @@
           <w:sz w:val="21"/>
           <w:szCs w:val="21"/>
         </w:rPr>
-        <w:t xml:space="preserve">Mes del período a publicar</w:t>
-      </w:r>
-    </w:p>
-    <w:p>
-      <w:pPr>
-        <w:numPr>
-          <w:ilvl w:val="0"/>
-          <w:numId w:val="23"/>
+        <w:t>Si la carpeta del período de destino ya existe, el módulo se detiene y avisa sin copiar nada, para no mezclar ni sobrescribir archivos.</w:t>
+      </w:r>
+    </w:p>
+    <w:p>
+      <w:pPr>
+        <w:numPr>
+          <w:ilvl w:val="0"/>
+          <w:numId w:val="10"/>
         </w:numPr>
         <w:spacing w:after="50" w:line="264" w:lineRule="auto"/>
         <w:jc w:val="both"/>
@@ -3278,7 +3251,37 @@
           <w:sz w:val="21"/>
           <w:szCs w:val="21"/>
         </w:rPr>
-        <w:t xml:space="preserve">Año del período a publicar</w:t>
+        <w:t>Los nombres de los archivos se ajustan solos, pero conviene revisarlos al terminar junto con los que el panel haya marcado como no renombrados.</w:t>
+      </w:r>
+    </w:p>
+    <w:p>
+      <w:pPr>
+        <w:spacing w:after="50" w:line="264" w:lineRule="auto"/>
+        <w:jc w:val="both"/>
+      </w:pPr>
+    </w:p>
+    <w:p>
+      <w:pPr>
+        <w:spacing w:after="50" w:line="264" w:lineRule="auto"/>
+        <w:jc w:val="both"/>
+        <w:pPrChange w:id="6" w:author="Emerson Garrido Villarroel" w:date="2026-08-21T09:45:00Z" w16du:dateUtc="2026-08-21T13:45:00Z">
+          <w:pPr>
+            <w:numPr>
+              <w:numId w:val="10"/>
+            </w:numPr>
+            <w:spacing w:after="50" w:line="264" w:lineRule="auto"/>
+            <w:ind w:left="460" w:hanging="260"/>
+            <w:jc w:val="both"/>
+          </w:pPr>
+        </w:pPrChange>
+      </w:pPr>
+    </w:p>
+    <w:p>
+      <w:pPr>
+        <w:pStyle w:val="TituloModulo"/>
+      </w:pPr>
+      <w:r>
+        <w:t>Publicar Linking</w:t>
       </w:r>
     </w:p>
     <w:p>
@@ -3289,14 +3292,49 @@
         <w:rPr>
           <w:spacing w:val="24"/>
         </w:rPr>
-        <w:t xml:space="preserve">CONDICIONES NECESARIAS</w:t>
-      </w:r>
-    </w:p>
-    <w:p>
-      <w:pPr>
-        <w:numPr>
-          <w:ilvl w:val="0"/>
-          <w:numId w:val="24"/>
+        <w:t>QUÉ HACE</w:t>
+      </w:r>
+    </w:p>
+    <w:p>
+      <w:pPr>
+        <w:jc w:val="both"/>
+      </w:pPr>
+      <w:r>
+        <w:t>Publica de una sola vez todos los links de todos los documentos de un período, sin tener que abrir archivo por archivo y presionar "Publish" en cada uno.</w:t>
+      </w:r>
+    </w:p>
+    <w:p>
+      <w:pPr>
+        <w:jc w:val="both"/>
+      </w:pPr>
+      <w:r>
+        <w:t>En Workiva un link tiene dos lados: el link fuente, que está en el archivo donde vive el dato original, y el link destino, que es donde ese dato se muestra. Cuando el valor cambia en el origen, el destino no se actualiza solo: hay que publicar. Publicar es exactamente eso, hacer que todos los links fuente de un archivo manden su valor actualizado a sus destinos.</w:t>
+      </w:r>
+    </w:p>
+    <w:p>
+      <w:pPr>
+        <w:jc w:val="both"/>
+      </w:pPr>
+      <w:r>
+        <w:t>El módulo recorre la carpeta del período completa, incluyendo los archivos que estén dentro de subcarpetas, y publica todos los links de cada archivo, no solamente los que editó el usuario que ejecuta la aplicación.</w:t>
+      </w:r>
+    </w:p>
+    <w:p>
+      <w:pPr>
+        <w:pStyle w:val="Etiqueta"/>
+      </w:pPr>
+      <w:r>
+        <w:rPr>
+          <w:spacing w:val="24"/>
+        </w:rPr>
+        <w:t>CAMPOS DE ENTRADA</w:t>
+      </w:r>
+    </w:p>
+    <w:p>
+      <w:pPr>
+        <w:numPr>
+          <w:ilvl w:val="0"/>
+          <w:numId w:val="12"/>
         </w:numPr>
         <w:spacing w:after="50" w:line="264" w:lineRule="auto"/>
         <w:jc w:val="both"/>
@@ -3306,14 +3344,14 @@
           <w:sz w:val="21"/>
           <w:szCs w:val="21"/>
         </w:rPr>
-        <w:t xml:space="preserve">Que exista la carpeta del período dentro de "Estados Financieros / {año}". Este módulo no crea ni copia nada: el período debe existir de antemano.</w:t>
-      </w:r>
-    </w:p>
-    <w:p>
-      <w:pPr>
-        <w:numPr>
-          <w:ilvl w:val="0"/>
-          <w:numId w:val="24"/>
+        <w:t>Mes del período a publicar</w:t>
+      </w:r>
+    </w:p>
+    <w:p>
+      <w:pPr>
+        <w:numPr>
+          <w:ilvl w:val="0"/>
+          <w:numId w:val="12"/>
         </w:numPr>
         <w:spacing w:after="50" w:line="264" w:lineRule="auto"/>
         <w:jc w:val="both"/>
@@ -3323,7 +3361,7 @@
           <w:sz w:val="21"/>
           <w:szCs w:val="21"/>
         </w:rPr>
-        <w:t xml:space="preserve">Tener permisos de propietario (owner) sobre los documentos. Workiva exige ese permiso para publicar todos los links de un archivo y no solo los propios.</w:t>
+        <w:t>Año del período a publicar</w:t>
       </w:r>
     </w:p>
     <w:p>
@@ -3334,77 +3372,14 @@
         <w:rPr>
           <w:spacing w:val="24"/>
         </w:rPr>
-        <w:t xml:space="preserve">PASOS DE USO</w:t>
-      </w:r>
-    </w:p>
-    <w:p>
-      <w:pPr>
-        <w:numPr>
-          <w:ilvl w:val="0"/>
-          <w:numId w:val="25"/>
-        </w:numPr>
-        <w:spacing w:after="90"/>
-        <w:jc w:val="both"/>
-      </w:pPr>
-      <w:r>
-        <w:t xml:space="preserve">Escribe el Mes y el Año del período cuyos links quieres publicar (ej: 08 y 2026).</w:t>
-      </w:r>
-    </w:p>
-    <w:p>
-      <w:pPr>
-        <w:numPr>
-          <w:ilvl w:val="0"/>
-          <w:numId w:val="25"/>
-        </w:numPr>
-        <w:spacing w:after="90"/>
-        <w:jc w:val="both"/>
-      </w:pPr>
-      <w:r>
-        <w:t xml:space="preserve">Presiona "Publicar Linking". Saldrá una alerta de confirmación advirtiendo que se van a publicar todos los links de todos los documentos de esa carpeta.</w:t>
-      </w:r>
-    </w:p>
-    <w:p>
-      <w:pPr>
-        <w:numPr>
-          <w:ilvl w:val="0"/>
-          <w:numId w:val="25"/>
-        </w:numPr>
-        <w:spacing w:after="90"/>
-        <w:jc w:val="both"/>
-      </w:pPr>
-      <w:r>
-        <w:t xml:space="preserve">Confirma. El panel de Actividad muestra en qué subcarpetas va entrando, cuántos archivos encontró en total y el resultado de cada uno a medida que avanza.</w:t>
-      </w:r>
-    </w:p>
-    <w:p>
-      <w:pPr>
-        <w:numPr>
-          <w:ilvl w:val="0"/>
-          <w:numId w:val="25"/>
-        </w:numPr>
-        <w:spacing w:after="90"/>
-        <w:jc w:val="both"/>
-      </w:pPr>
-      <w:r>
-        <w:t xml:space="preserve">Al terminar aparece un mensaje con el resumen: cuántos archivos se publicaron y cuántos se omitieron (tipos de archivo que no tienen links que publicar, como las carpetas).</w:t>
-      </w:r>
-    </w:p>
-    <w:p>
-      <w:pPr>
-        <w:pStyle w:val="Etiqueta"/>
-      </w:pPr>
-      <w:r>
-        <w:rPr>
-          <w:spacing w:val="24"/>
-        </w:rPr>
-        <w:t xml:space="preserve">A TENER EN CUENTA</w:t>
-      </w:r>
-    </w:p>
-    <w:p>
-      <w:pPr>
-        <w:numPr>
-          <w:ilvl w:val="0"/>
-          <w:numId w:val="24"/>
+        <w:t>CONDICIONES NECESARIAS</w:t>
+      </w:r>
+    </w:p>
+    <w:p>
+      <w:pPr>
+        <w:numPr>
+          <w:ilvl w:val="0"/>
+          <w:numId w:val="13"/>
         </w:numPr>
         <w:spacing w:after="50" w:line="264" w:lineRule="auto"/>
         <w:jc w:val="both"/>
@@ -3414,14 +3389,14 @@
           <w:sz w:val="21"/>
           <w:szCs w:val="21"/>
         </w:rPr>
-        <w:t xml:space="preserve">El número del resumen es la cantidad de ARCHIVOS publicados, no la de links: cada archivo puede contener muchos links.</w:t>
-      </w:r>
-    </w:p>
-    <w:p>
-      <w:pPr>
-        <w:numPr>
-          <w:ilvl w:val="0"/>
-          <w:numId w:val="24"/>
+        <w:t>Que exista la carpeta del período dentro de "Estados Financieros / {año}". Este módulo no crea ni copia nada: el período debe existir de antemano.</w:t>
+      </w:r>
+    </w:p>
+    <w:p>
+      <w:pPr>
+        <w:numPr>
+          <w:ilvl w:val="0"/>
+          <w:numId w:val="13"/>
         </w:numPr>
         <w:spacing w:after="50" w:line="264" w:lineRule="auto"/>
         <w:jc w:val="both"/>
@@ -3431,12 +3406,121 @@
           <w:sz w:val="21"/>
           <w:szCs w:val="21"/>
         </w:rPr>
-        <w:t xml:space="preserve">El proceso puede tardar varios minutos según cuántos documentos tenga el período, porque espera a que Workiva termine de publicar cada archivo antes de pasar al siguiente.</w:t>
+        <w:t>Tener permisos de propietario (owner) sobre los documentos. Workiva exige ese permiso para publicar todos los links de un archivo y no solo los propios.</w:t>
+      </w:r>
+    </w:p>
+    <w:p>
+      <w:pPr>
+        <w:pStyle w:val="Etiqueta"/>
+      </w:pPr>
+      <w:r>
+        <w:rPr>
+          <w:spacing w:val="24"/>
+        </w:rPr>
+        <w:lastRenderedPageBreak/>
+        <w:t>PASOS DE USO</w:t>
+      </w:r>
+    </w:p>
+    <w:p>
+      <w:pPr>
+        <w:numPr>
+          <w:ilvl w:val="0"/>
+          <w:numId w:val="14"/>
+        </w:numPr>
+        <w:spacing w:after="90"/>
+        <w:jc w:val="both"/>
+      </w:pPr>
+      <w:r>
+        <w:t>Escribe el Mes y el Año del período cuyos links quieres publicar (ej: 08 y 2026).</w:t>
+      </w:r>
+    </w:p>
+    <w:p>
+      <w:pPr>
+        <w:numPr>
+          <w:ilvl w:val="0"/>
+          <w:numId w:val="14"/>
+        </w:numPr>
+        <w:spacing w:after="90"/>
+        <w:jc w:val="both"/>
+      </w:pPr>
+      <w:r>
+        <w:t>Presiona "Publicar Linking". Saldrá una alerta de confirmación advirtiendo que se van a publicar todos los links de todos los documentos de esa carpeta.</w:t>
+      </w:r>
+    </w:p>
+    <w:p>
+      <w:pPr>
+        <w:numPr>
+          <w:ilvl w:val="0"/>
+          <w:numId w:val="14"/>
+        </w:numPr>
+        <w:spacing w:after="90"/>
+        <w:jc w:val="both"/>
+      </w:pPr>
+      <w:r>
+        <w:t>Confirma. El panel de Actividad muestra en qué subcarpetas va entrando, cuántos archivos encontró en total y el resultado de cada uno a medida que avanza.</w:t>
+      </w:r>
+    </w:p>
+    <w:p>
+      <w:pPr>
+        <w:numPr>
+          <w:ilvl w:val="0"/>
+          <w:numId w:val="14"/>
+        </w:numPr>
+        <w:spacing w:after="90"/>
+        <w:jc w:val="both"/>
+      </w:pPr>
+      <w:r>
+        <w:t>Al terminar aparece un mensaje con el resumen: cuántos archivos se publicaron y cuántos se omitieron (tipos de archivo que no tienen links que publicar, como las carpetas).</w:t>
+      </w:r>
+    </w:p>
+    <w:p>
+      <w:pPr>
+        <w:pStyle w:val="Etiqueta"/>
+      </w:pPr>
+      <w:r>
+        <w:rPr>
+          <w:spacing w:val="24"/>
+        </w:rPr>
+        <w:t>A TENER EN CUENTA</w:t>
+      </w:r>
+    </w:p>
+    <w:p>
+      <w:pPr>
+        <w:numPr>
+          <w:ilvl w:val="0"/>
+          <w:numId w:val="13"/>
+        </w:numPr>
+        <w:spacing w:after="50" w:line="264" w:lineRule="auto"/>
+        <w:jc w:val="both"/>
+      </w:pPr>
+      <w:r>
+        <w:rPr>
+          <w:sz w:val="21"/>
+          <w:szCs w:val="21"/>
+        </w:rPr>
+        <w:t>El número del resumen es la cantidad de ARCHIVOS publicados, no la de links: cada archivo puede contener muchos links.</w:t>
+      </w:r>
+    </w:p>
+    <w:p>
+      <w:pPr>
+        <w:numPr>
+          <w:ilvl w:val="0"/>
+          <w:numId w:val="13"/>
+        </w:numPr>
+        <w:spacing w:after="50" w:line="264" w:lineRule="auto"/>
+        <w:jc w:val="both"/>
+      </w:pPr>
+      <w:r>
+        <w:rPr>
+          <w:sz w:val="21"/>
+          <w:szCs w:val="21"/>
+        </w:rPr>
+        <w:t>El proceso puede tardar varios minutos según cuántos documentos tenga el período, porque espera a que Workiva termine de publicar cada archivo antes de pasar al siguiente.</w:t>
       </w:r>
     </w:p>
     <w:sectPr>
       <w:footerReference w:type="default" r:id="rId32"/>
-      <w:pgSz w:w="12240" w:h="15840" w:orient="portrait"/>
+      <w:pgSz w:w="12240" w:h="15840"/>
       <w:pgMar w:top="1296" w:right="1440" w:bottom="1296" w:left="1440" w:header="708" w:footer="680" w:gutter="0"/>
       <w:cols w:space="720"/>
       <w:docGrid w:linePitch="360"/>
@@ -3446,8 +3530,8 @@
 </file>
 
 <file path=word/comments.xml><?xml version="1.0" encoding="utf-8"?>
-<w:comments xmlns:wpc="http://schemas.microsoft.com/office/word/2010/wordprocessingCanvas" xmlns:cx="http://schemas.microsoft.com/office/drawing/2014/chartex" xmlns:cx1="http://schemas.microsoft.com/office/drawing/2015/9/8/chartex" xmlns:cx2="http://schemas.microsoft.com/office/drawing/2015/10/21/chartex" xmlns:cx3="http://schemas.microsoft.com/office/drawing/2016/5/9/chartex" xmlns:cx4="http://schemas.microsoft.com/office/drawing/2016/5/10/chartex" xmlns:cx5="http://schemas.microsoft.com/office/drawing/2016/5/11/chartex" xmlns:cx6="http://schemas.microsoft.com/office/drawing/2016/5/12/chartex" xmlns:cx7="http://schemas.microsoft.com/office/drawing/2016/5/13/chartex" xmlns:cx8="http://schemas.microsoft.com/office/drawing/2016/5/14/chartex" xmlns:mc="http://schemas.openxmlformats.org/markup-compatibility/2006" xmlns:aink="http://schemas.microsoft.com/office/drawing/2016/ink" xmlns:am3d="http://schemas.microsoft.com/office/drawing/2017/model3d" xmlns:o="urn:schemas-microsoft-com:office:office" xmlns:oel="http://schemas.microsoft.com/office/2019/extlst" xmlns:r="http://schemas.openxmlformats.org/officeDocument/2006/relationships" xmlns:m="http://schemas.openxmlformats.org/officeDocument/2006/math" xmlns:v="urn:schemas-microsoft-com:vml" xmlns:wp14="http://schemas.microsoft.com/office/word/2010/wordprocessingDrawing" xmlns:wp="http://schemas.openxmlformats.org/drawingml/2006/wordprocessingDrawing" xmlns:w10="urn:schemas-microsoft-com:office:word" xmlns:w="http://schemas.openxmlformats.org/wordprocessingml/2006/main" xmlns:w14="http://schemas.microsoft.com/office/word/2010/wordml" xmlns:w15="http://schemas.microsoft.com/office/word/2012/wordml" xmlns:w16cex="http://schemas.microsoft.com/office/word/2018/wordml/cex" xmlns:w16cid="http://schemas.microsoft.com/office/word/2016/wordml/cid" xmlns:w16="http://schemas.microsoft.com/office/word/2018/wordml" xmlns:w16du="http://schemas.microsoft.com/office/word/2023/wordml/word16du" xmlns:w16sdtdh="http://schemas.microsoft.com/office/word/2020/wordml/sdtdatahash" xmlns:w16sdtfl="http://schemas.microsoft.com/office/word/2024/wordml/sdtformatlock" xmlns:w16se="http://schemas.microsoft.com/office/word/2015/wordml/symex" xmlns:wpg="http://schemas.microsoft.com/office/word/2010/wordprocessingGroup" xmlns:wpi="http://schemas.microsoft.com/office/word/2010/wordprocessingInk" xmlns:wne="http://schemas.microsoft.com/office/word/2006/wordml" xmlns:wps="http://schemas.microsoft.com/office/word/2010/wordprocessingShape" mc:Ignorable="w14 w15 w16se w16cid w16 w16cex w16sdtdh w16sdtfl w16du wp14">
-  <w:comment w:initials="SF" w:author="Sergio Andres Flores Olivares" w:date="2026-08-05T12:15:00Z" w:id="20">
+<w:comments xmlns:wpc="http://schemas.microsoft.com/office/word/2010/wordprocessingCanvas" xmlns:cx="http://schemas.microsoft.com/office/drawing/2014/chartex" xmlns:cx1="http://schemas.microsoft.com/office/drawing/2015/9/8/chartex" xmlns:cx2="http://schemas.microsoft.com/office/drawing/2015/10/21/chartex" xmlns:cx3="http://schemas.microsoft.com/office/drawing/2016/5/9/chartex" xmlns:cx4="http://schemas.microsoft.com/office/drawing/2016/5/10/chartex" xmlns:cx5="http://schemas.microsoft.com/office/drawing/2016/5/11/chartex" xmlns:cx6="http://schemas.microsoft.com/office/drawing/2016/5/12/chartex" xmlns:cx7="http://schemas.microsoft.com/office/drawing/2016/5/13/chartex" xmlns:cx8="http://schemas.microsoft.com/office/drawing/2016/5/14/chartex" xmlns:mc="http://schemas.openxmlformats.org/markup-compatibility/2006" xmlns:aink="http://schemas.microsoft.com/office/drawing/2016/ink" xmlns:am3d="http://schemas.microsoft.com/office/drawing/2017/model3d" xmlns:o="urn:schemas-microsoft-com:office:office" xmlns:oel="http://schemas.microsoft.com/office/2019/extlst" xmlns:r="http://schemas.openxmlformats.org/officeDocument/2006/relationships" xmlns:m="http://schemas.openxmlformats.org/officeDocument/2006/math" xmlns:v="urn:schemas-microsoft-com:vml" xmlns:wp14="http://schemas.microsoft.com/office/word/2010/wordprocessingDrawing" xmlns:wp="http://schemas.openxmlformats.org/drawingml/2006/wordprocessingDrawing" xmlns:w10="urn:schemas-microsoft-com:office:word" xmlns:w="http://schemas.openxmlformats.org/wordprocessingml/2006/main" xmlns:w14="http://schemas.microsoft.com/office/word/2010/wordml" xmlns:w15="http://schemas.microsoft.com/office/word/2012/wordml" xmlns:w16cei="http://schemas.microsoft.com/office/word/2026/wordml/cei" xmlns:w16cex="http://schemas.microsoft.com/office/word/2018/wordml/cex" xmlns:w16cid="http://schemas.microsoft.com/office/word/2016/wordml/cid" xmlns:w16="http://schemas.microsoft.com/office/word/2018/wordml" xmlns:w16du="http://schemas.microsoft.com/office/word/2023/wordml/word16du" xmlns:w16sdtdh="http://schemas.microsoft.com/office/word/2020/wordml/sdtdatahash" xmlns:w16sdtfl="http://schemas.microsoft.com/office/word/2024/wordml/sdtformatlock" xmlns:w16se="http://schemas.microsoft.com/office/word/2015/wordml/symex" xmlns:wpg="http://schemas.microsoft.com/office/word/2010/wordprocessingGroup" xmlns:wpi="http://schemas.microsoft.com/office/word/2010/wordprocessingInk" xmlns:wne="http://schemas.microsoft.com/office/word/2006/wordml" xmlns:wps="http://schemas.microsoft.com/office/word/2010/wordprocessingShape" mc:Ignorable="w14 w15 w16se w16cid w16 w16cex w16sdtdh w16sdtfl w16du wp14">
+  <w:comment w:id="0" w:author="Sergio Andres Flores Olivares" w:date="2026-08-05T12:15:00Z" w:initials="SF">
     <w:p>
       <w:pPr>
         <w:pStyle w:val="Textocomentario"/>
@@ -3464,11 +3548,11 @@
       <w:r>
         <w:instrText>HYPERLINK "mailto:egarridov@GRUPOCGE.CL"</w:instrText>
       </w:r>
-      <w:bookmarkStart w:name="_@_706435BC681849B0BDDA189FF5487EF2Z" w:id="21"/>
+      <w:bookmarkStart w:id="1" w:name="_@_706435BC681849B0BDDA189FF5487EF2Z"/>
       <w:r>
         <w:fldChar w:fldCharType="separate"/>
       </w:r>
-      <w:bookmarkEnd w:id="21"/>
+      <w:bookmarkEnd w:id="1"/>
       <w:r>
         <w:rPr>
           <w:rStyle w:val="Mencionar"/>
@@ -3484,7 +3568,7 @@
       </w:r>
     </w:p>
   </w:comment>
-  <w:comment w:initials="SF" w:author="Sergio Andres Flores Olivares" w:date="2026-08-05T12:24:00Z" w:id="27">
+  <w:comment w:id="2" w:author="Sergio Andres Flores Olivares" w:date="2026-08-05T12:24:00Z" w:initials="SF">
     <w:p>
       <w:pPr>
         <w:pStyle w:val="Textocomentario"/>
@@ -3501,11 +3585,11 @@
       <w:r>
         <w:instrText>HYPERLINK "mailto:egarridov@GRUPOCGE.CL"</w:instrText>
       </w:r>
-      <w:bookmarkStart w:name="_@_A6A613009C6049F7A7608230BBD21CFAZ" w:id="28"/>
+      <w:bookmarkStart w:id="3" w:name="_@_A6A613009C6049F7A7608230BBD21CFAZ"/>
       <w:r>
         <w:fldChar w:fldCharType="separate"/>
       </w:r>
-      <w:bookmarkEnd w:id="28"/>
+      <w:bookmarkEnd w:id="3"/>
       <w:r>
         <w:rPr>
           <w:rStyle w:val="Mencionar"/>
@@ -3525,28 +3609,28 @@
 </file>
 
 <file path=word/commentsExtended.xml><?xml version="1.0" encoding="utf-8"?>
-<w15:commentsEx xmlns:wpc="http://schemas.microsoft.com/office/word/2010/wordprocessingCanvas" xmlns:cx="http://schemas.microsoft.com/office/drawing/2014/chartex" xmlns:cx1="http://schemas.microsoft.com/office/drawing/2015/9/8/chartex" xmlns:cx2="http://schemas.microsoft.com/office/drawing/2015/10/21/chartex" xmlns:cx3="http://schemas.microsoft.com/office/drawing/2016/5/9/chartex" xmlns:cx4="http://schemas.microsoft.com/office/drawing/2016/5/10/chartex" xmlns:cx5="http://schemas.microsoft.com/office/drawing/2016/5/11/chartex" xmlns:cx6="http://schemas.microsoft.com/office/drawing/2016/5/12/chartex" xmlns:cx7="http://schemas.microsoft.com/office/drawing/2016/5/13/chartex" xmlns:cx8="http://schemas.microsoft.com/office/drawing/2016/5/14/chartex" xmlns:mc="http://schemas.openxmlformats.org/markup-compatibility/2006" xmlns:aink="http://schemas.microsoft.com/office/drawing/2016/ink" xmlns:am3d="http://schemas.microsoft.com/office/drawing/2017/model3d" xmlns:o="urn:schemas-microsoft-com:office:office" xmlns:oel="http://schemas.microsoft.com/office/2019/extlst" xmlns:r="http://schemas.openxmlformats.org/officeDocument/2006/relationships" xmlns:m="http://schemas.openxmlformats.org/officeDocument/2006/math" xmlns:v="urn:schemas-microsoft-com:vml" xmlns:wp14="http://schemas.microsoft.com/office/word/2010/wordprocessingDrawing" xmlns:wp="http://schemas.openxmlformats.org/drawingml/2006/wordprocessingDrawing" xmlns:w10="urn:schemas-microsoft-com:office:word" xmlns:w="http://schemas.openxmlformats.org/wordprocessingml/2006/main" xmlns:w14="http://schemas.microsoft.com/office/word/2010/wordml" xmlns:w15="http://schemas.microsoft.com/office/word/2012/wordml" xmlns:w16cex="http://schemas.microsoft.com/office/word/2018/wordml/cex" xmlns:w16cid="http://schemas.microsoft.com/office/word/2016/wordml/cid" xmlns:w16="http://schemas.microsoft.com/office/word/2018/wordml" xmlns:w16du="http://schemas.microsoft.com/office/word/2023/wordml/word16du" xmlns:w16sdtdh="http://schemas.microsoft.com/office/word/2020/wordml/sdtdatahash" xmlns:w16sdtfl="http://schemas.microsoft.com/office/word/2024/wordml/sdtformatlock" xmlns:w16se="http://schemas.microsoft.com/office/word/2015/wordml/symex" xmlns:wpg="http://schemas.microsoft.com/office/word/2010/wordprocessingGroup" xmlns:wpi="http://schemas.microsoft.com/office/word/2010/wordprocessingInk" xmlns:wne="http://schemas.microsoft.com/office/word/2006/wordml" xmlns:wps="http://schemas.microsoft.com/office/word/2010/wordprocessingShape" mc:Ignorable="w14 w15 w16se w16cid w16 w16cex w16sdtdh w16sdtfl w16du wp14">
+<w15:commentsEx xmlns:wpc="http://schemas.microsoft.com/office/word/2010/wordprocessingCanvas" xmlns:cx="http://schemas.microsoft.com/office/drawing/2014/chartex" xmlns:cx1="http://schemas.microsoft.com/office/drawing/2015/9/8/chartex" xmlns:cx2="http://schemas.microsoft.com/office/drawing/2015/10/21/chartex" xmlns:cx3="http://schemas.microsoft.com/office/drawing/2016/5/9/chartex" xmlns:cx4="http://schemas.microsoft.com/office/drawing/2016/5/10/chartex" xmlns:cx5="http://schemas.microsoft.com/office/drawing/2016/5/11/chartex" xmlns:cx6="http://schemas.microsoft.com/office/drawing/2016/5/12/chartex" xmlns:cx7="http://schemas.microsoft.com/office/drawing/2016/5/13/chartex" xmlns:cx8="http://schemas.microsoft.com/office/drawing/2016/5/14/chartex" xmlns:mc="http://schemas.openxmlformats.org/markup-compatibility/2006" xmlns:aink="http://schemas.microsoft.com/office/drawing/2016/ink" xmlns:am3d="http://schemas.microsoft.com/office/drawing/2017/model3d" xmlns:o="urn:schemas-microsoft-com:office:office" xmlns:oel="http://schemas.microsoft.com/office/2019/extlst" xmlns:r="http://schemas.openxmlformats.org/officeDocument/2006/relationships" xmlns:m="http://schemas.openxmlformats.org/officeDocument/2006/math" xmlns:v="urn:schemas-microsoft-com:vml" xmlns:wp14="http://schemas.microsoft.com/office/word/2010/wordprocessingDrawing" xmlns:wp="http://schemas.openxmlformats.org/drawingml/2006/wordprocessingDrawing" xmlns:w10="urn:schemas-microsoft-com:office:word" xmlns:w="http://schemas.openxmlformats.org/wordprocessingml/2006/main" xmlns:w14="http://schemas.microsoft.com/office/word/2010/wordml" xmlns:w15="http://schemas.microsoft.com/office/word/2012/wordml" xmlns:w16cei="http://schemas.microsoft.com/office/word/2026/wordml/cei" xmlns:w16cex="http://schemas.microsoft.com/office/word/2018/wordml/cex" xmlns:w16cid="http://schemas.microsoft.com/office/word/2016/wordml/cid" xmlns:w16="http://schemas.microsoft.com/office/word/2018/wordml" xmlns:w16du="http://schemas.microsoft.com/office/word/2023/wordml/word16du" xmlns:w16sdtdh="http://schemas.microsoft.com/office/word/2020/wordml/sdtdatahash" xmlns:w16sdtfl="http://schemas.microsoft.com/office/word/2024/wordml/sdtformatlock" xmlns:w16se="http://schemas.microsoft.com/office/word/2015/wordml/symex" xmlns:wpg="http://schemas.microsoft.com/office/word/2010/wordprocessingGroup" xmlns:wpi="http://schemas.microsoft.com/office/word/2010/wordprocessingInk" xmlns:wne="http://schemas.microsoft.com/office/word/2006/wordml" xmlns:wps="http://schemas.microsoft.com/office/word/2010/wordprocessingShape" mc:Ignorable="w14 w15 w16se w16cid w16 w16cex w16sdtdh w16sdtfl w16du wp14">
   <w15:commentEx w15:paraId="053E8E07" w15:done="1"/>
   <w15:commentEx w15:paraId="18BA7D1B" w15:done="1"/>
 </w15:commentsEx>
 </file>
 
 <file path=word/commentsExtensible.xml><?xml version="1.0" encoding="utf-8"?>
-<w16cex:commentsExtensible xmlns:wpc="http://schemas.microsoft.com/office/word/2010/wordprocessingCanvas" xmlns:cx="http://schemas.microsoft.com/office/drawing/2014/chartex" xmlns:cx1="http://schemas.microsoft.com/office/drawing/2015/9/8/chartex" xmlns:cx2="http://schemas.microsoft.com/office/drawing/2015/10/21/chartex" xmlns:cx3="http://schemas.microsoft.com/office/drawing/2016/5/9/chartex" xmlns:cx4="http://schemas.microsoft.com/office/drawing/2016/5/10/chartex" xmlns:cx5="http://schemas.microsoft.com/office/drawing/2016/5/11/chartex" xmlns:cx6="http://schemas.microsoft.com/office/drawing/2016/5/12/chartex" xmlns:cx7="http://schemas.microsoft.com/office/drawing/2016/5/13/chartex" xmlns:cx8="http://schemas.microsoft.com/office/drawing/2016/5/14/chartex" xmlns:cr="http://schemas.microsoft.com/office/comments/2020/reactions" xmlns:mc="http://schemas.openxmlformats.org/markup-compatibility/2006" xmlns:aink="http://schemas.microsoft.com/office/drawing/2016/ink" xmlns:am3d="http://schemas.microsoft.com/office/drawing/2017/model3d" xmlns:o="urn:schemas-microsoft-com:office:office" xmlns:oel="http://schemas.microsoft.com/office/2019/extlst" xmlns:r="http://schemas.openxmlformats.org/officeDocument/2006/relationships" xmlns:m="http://schemas.openxmlformats.org/officeDocument/2006/math" xmlns:v="urn:schemas-microsoft-com:vml" xmlns:wp14="http://schemas.microsoft.com/office/word/2010/wordprocessingDrawing" xmlns:wp="http://schemas.openxmlformats.org/drawingml/2006/wordprocessingDrawing" xmlns:w10="urn:schemas-microsoft-com:office:word" xmlns:w="http://schemas.openxmlformats.org/wordprocessingml/2006/main" xmlns:w14="http://schemas.microsoft.com/office/word/2010/wordml" xmlns:w15="http://schemas.microsoft.com/office/word/2012/wordml" xmlns:w16cex="http://schemas.microsoft.com/office/word/2018/wordml/cex" xmlns:w16cid="http://schemas.microsoft.com/office/word/2016/wordml/cid" xmlns:w16="http://schemas.microsoft.com/office/word/2018/wordml" xmlns:w16du="http://schemas.microsoft.com/office/word/2023/wordml/word16du" xmlns:w16sdtdh="http://schemas.microsoft.com/office/word/2020/wordml/sdtdatahash" xmlns:w16sdtfl="http://schemas.microsoft.com/office/word/2024/wordml/sdtformatlock" xmlns:w16se="http://schemas.microsoft.com/office/word/2015/wordml/symex" xmlns:wpg="http://schemas.microsoft.com/office/word/2010/wordprocessingGroup" xmlns:wpi="http://schemas.microsoft.com/office/word/2010/wordprocessingInk" xmlns:wne="http://schemas.microsoft.com/office/word/2006/wordml" xmlns:wps="http://schemas.microsoft.com/office/word/2010/wordprocessingShape" mc:Ignorable="w14 w15 w16se w16cid w16 w16cex w16sdtdh w16sdtfl cr w16du wp14">
+<w16cex:commentsExtensible xmlns:wpc="http://schemas.microsoft.com/office/word/2010/wordprocessingCanvas" xmlns:cx="http://schemas.microsoft.com/office/drawing/2014/chartex" xmlns:cx1="http://schemas.microsoft.com/office/drawing/2015/9/8/chartex" xmlns:cx2="http://schemas.microsoft.com/office/drawing/2015/10/21/chartex" xmlns:cx3="http://schemas.microsoft.com/office/drawing/2016/5/9/chartex" xmlns:cx4="http://schemas.microsoft.com/office/drawing/2016/5/10/chartex" xmlns:cx5="http://schemas.microsoft.com/office/drawing/2016/5/11/chartex" xmlns:cx6="http://schemas.microsoft.com/office/drawing/2016/5/12/chartex" xmlns:cx7="http://schemas.microsoft.com/office/drawing/2016/5/13/chartex" xmlns:cx8="http://schemas.microsoft.com/office/drawing/2016/5/14/chartex" xmlns:cr="http://schemas.microsoft.com/office/comments/2020/reactions" xmlns:mc="http://schemas.openxmlformats.org/markup-compatibility/2006" xmlns:aink="http://schemas.microsoft.com/office/drawing/2016/ink" xmlns:am3d="http://schemas.microsoft.com/office/drawing/2017/model3d" xmlns:o="urn:schemas-microsoft-com:office:office" xmlns:oel="http://schemas.microsoft.com/office/2019/extlst" xmlns:r="http://schemas.openxmlformats.org/officeDocument/2006/relationships" xmlns:m="http://schemas.openxmlformats.org/officeDocument/2006/math" xmlns:v="urn:schemas-microsoft-com:vml" xmlns:wp14="http://schemas.microsoft.com/office/word/2010/wordprocessingDrawing" xmlns:wp="http://schemas.openxmlformats.org/drawingml/2006/wordprocessingDrawing" xmlns:w10="urn:schemas-microsoft-com:office:word" xmlns:w="http://schemas.openxmlformats.org/wordprocessingml/2006/main" xmlns:w14="http://schemas.microsoft.com/office/word/2010/wordml" xmlns:w15="http://schemas.microsoft.com/office/word/2012/wordml" xmlns:w16cei="http://schemas.microsoft.com/office/word/2026/wordml/cei" xmlns:w16cex="http://schemas.microsoft.com/office/word/2018/wordml/cex" xmlns:w16cid="http://schemas.microsoft.com/office/word/2016/wordml/cid" xmlns:w16="http://schemas.microsoft.com/office/word/2018/wordml" xmlns:w16du="http://schemas.microsoft.com/office/word/2023/wordml/word16du" xmlns:w16sdtdh="http://schemas.microsoft.com/office/word/2020/wordml/sdtdatahash" xmlns:w16sdtfl="http://schemas.microsoft.com/office/word/2024/wordml/sdtformatlock" xmlns:w16se="http://schemas.microsoft.com/office/word/2015/wordml/symex" xmlns:wpg="http://schemas.microsoft.com/office/word/2010/wordprocessingGroup" xmlns:wpi="http://schemas.microsoft.com/office/word/2010/wordprocessingInk" xmlns:wne="http://schemas.microsoft.com/office/word/2006/wordml" xmlns:wps="http://schemas.microsoft.com/office/word/2010/wordprocessingShape" mc:Ignorable="w14 w15 w16se w16cid w16 w16cex w16sdtdh w16sdtfl cr w16du wp14">
   <w16cex:commentExtensible w16cex:durableId="7191D6F7" w16cex:dateUtc="2026-08-05T16:15:00Z"/>
   <w16cex:commentExtensible w16cex:durableId="44E9A50E" w16cex:dateUtc="2026-08-05T16:24:00Z"/>
 </w16cex:commentsExtensible>
 </file>
 
 <file path=word/commentsIds.xml><?xml version="1.0" encoding="utf-8"?>
-<w16cid:commentsIds xmlns:wpc="http://schemas.microsoft.com/office/word/2010/wordprocessingCanvas" xmlns:cx="http://schemas.microsoft.com/office/drawing/2014/chartex" xmlns:cx1="http://schemas.microsoft.com/office/drawing/2015/9/8/chartex" xmlns:cx2="http://schemas.microsoft.com/office/drawing/2015/10/21/chartex" xmlns:cx3="http://schemas.microsoft.com/office/drawing/2016/5/9/chartex" xmlns:cx4="http://schemas.microsoft.com/office/drawing/2016/5/10/chartex" xmlns:cx5="http://schemas.microsoft.com/office/drawing/2016/5/11/chartex" xmlns:cx6="http://schemas.microsoft.com/office/drawing/2016/5/12/chartex" xmlns:cx7="http://schemas.microsoft.com/office/drawing/2016/5/13/chartex" xmlns:cx8="http://schemas.microsoft.com/office/drawing/2016/5/14/chartex" xmlns:mc="http://schemas.openxmlformats.org/markup-compatibility/2006" xmlns:aink="http://schemas.microsoft.com/office/drawing/2016/ink" xmlns:am3d="http://schemas.microsoft.com/office/drawing/2017/model3d" xmlns:o="urn:schemas-microsoft-com:office:office" xmlns:oel="http://schemas.microsoft.com/office/2019/extlst" xmlns:r="http://schemas.openxmlformats.org/officeDocument/2006/relationships" xmlns:m="http://schemas.openxmlformats.org/officeDocument/2006/math" xmlns:v="urn:schemas-microsoft-com:vml" xmlns:wp14="http://schemas.microsoft.com/office/word/2010/wordprocessingDrawing" xmlns:wp="http://schemas.openxmlformats.org/drawingml/2006/wordprocessingDrawing" xmlns:w10="urn:schemas-microsoft-com:office:word" xmlns:w="http://schemas.openxmlformats.org/wordprocessingml/2006/main" xmlns:w14="http://schemas.microsoft.com/office/word/2010/wordml" xmlns:w15="http://schemas.microsoft.com/office/word/2012/wordml" xmlns:w16cex="http://schemas.microsoft.com/office/word/2018/wordml/cex" xmlns:w16cid="http://schemas.microsoft.com/office/word/2016/wordml/cid" xmlns:w16="http://schemas.microsoft.com/office/word/2018/wordml" xmlns:w16du="http://schemas.microsoft.com/office/word/2023/wordml/word16du" xmlns:w16sdtdh="http://schemas.microsoft.com/office/word/2020/wordml/sdtdatahash" xmlns:w16sdtfl="http://schemas.microsoft.com/office/word/2024/wordml/sdtformatlock" xmlns:w16se="http://schemas.microsoft.com/office/word/2015/wordml/symex" xmlns:wpg="http://schemas.microsoft.com/office/word/2010/wordprocessingGroup" xmlns:wpi="http://schemas.microsoft.com/office/word/2010/wordprocessingInk" xmlns:wne="http://schemas.microsoft.com/office/word/2006/wordml" xmlns:wps="http://schemas.microsoft.com/office/word/2010/wordprocessingShape" mc:Ignorable="w14 w15 w16se w16cid w16 w16cex w16sdtdh w16sdtfl w16du wp14">
+<w16cid:commentsIds xmlns:wpc="http://schemas.microsoft.com/office/word/2010/wordprocessingCanvas" xmlns:cx="http://schemas.microsoft.com/office/drawing/2014/chartex" xmlns:cx1="http://schemas.microsoft.com/office/drawing/2015/9/8/chartex" xmlns:cx2="http://schemas.microsoft.com/office/drawing/2015/10/21/chartex" xmlns:cx3="http://schemas.microsoft.com/office/drawing/2016/5/9/chartex" xmlns:cx4="http://schemas.microsoft.com/office/drawing/2016/5/10/chartex" xmlns:cx5="http://schemas.microsoft.com/office/drawing/2016/5/11/chartex" xmlns:cx6="http://schemas.microsoft.com/office/drawing/2016/5/12/chartex" xmlns:cx7="http://schemas.microsoft.com/office/drawing/2016/5/13/chartex" xmlns:cx8="http://schemas.microsoft.com/office/drawing/2016/5/14/chartex" xmlns:mc="http://schemas.openxmlformats.org/markup-compatibility/2006" xmlns:aink="http://schemas.microsoft.com/office/drawing/2016/ink" xmlns:am3d="http://schemas.microsoft.com/office/drawing/2017/model3d" xmlns:o="urn:schemas-microsoft-com:office:office" xmlns:oel="http://schemas.microsoft.com/office/2019/extlst" xmlns:r="http://schemas.openxmlformats.org/officeDocument/2006/relationships" xmlns:m="http://schemas.openxmlformats.org/officeDocument/2006/math" xmlns:v="urn:schemas-microsoft-com:vml" xmlns:wp14="http://schemas.microsoft.com/office/word/2010/wordprocessingDrawing" xmlns:wp="http://schemas.openxmlformats.org/drawingml/2006/wordprocessingDrawing" xmlns:w10="urn:schemas-microsoft-com:office:word" xmlns:w="http://schemas.openxmlformats.org/wordprocessingml/2006/main" xmlns:w14="http://schemas.microsoft.com/office/word/2010/wordml" xmlns:w15="http://schemas.microsoft.com/office/word/2012/wordml" xmlns:w16cei="http://schemas.microsoft.com/office/word/2026/wordml/cei" xmlns:w16cex="http://schemas.microsoft.com/office/word/2018/wordml/cex" xmlns:w16cid="http://schemas.microsoft.com/office/word/2016/wordml/cid" xmlns:w16="http://schemas.microsoft.com/office/word/2018/wordml" xmlns:w16du="http://schemas.microsoft.com/office/word/2023/wordml/word16du" xmlns:w16sdtdh="http://schemas.microsoft.com/office/word/2020/wordml/sdtdatahash" xmlns:w16sdtfl="http://schemas.microsoft.com/office/word/2024/wordml/sdtformatlock" xmlns:w16se="http://schemas.microsoft.com/office/word/2015/wordml/symex" xmlns:wpg="http://schemas.microsoft.com/office/word/2010/wordprocessingGroup" xmlns:wpi="http://schemas.microsoft.com/office/word/2010/wordprocessingInk" xmlns:wne="http://schemas.microsoft.com/office/word/2006/wordml" xmlns:wps="http://schemas.microsoft.com/office/word/2010/wordprocessingShape" mc:Ignorable="w14 w15 w16se w16cid w16 w16cex w16sdtdh w16sdtfl w16du wp14">
   <w16cid:commentId w16cid:paraId="053E8E07" w16cid:durableId="7191D6F7"/>
   <w16cid:commentId w16cid:paraId="18BA7D1B" w16cid:durableId="44E9A50E"/>
 </w16cid:commentsIds>
 </file>
 
 <file path=word/endnotes.xml><?xml version="1.0" encoding="utf-8"?>
-<w:endnotes xmlns:wpc="http://schemas.microsoft.com/office/word/2010/wordprocessingCanvas" xmlns:cx="http://schemas.microsoft.com/office/drawing/2014/chartex" xmlns:cx1="http://schemas.microsoft.com/office/drawing/2015/9/8/chartex" xmlns:cx2="http://schemas.microsoft.com/office/drawing/2015/10/21/chartex" xmlns:cx3="http://schemas.microsoft.com/office/drawing/2016/5/9/chartex" xmlns:cx4="http://schemas.microsoft.com/office/drawing/2016/5/10/chartex" xmlns:cx5="http://schemas.microsoft.com/office/drawing/2016/5/11/chartex" xmlns:cx6="http://schemas.microsoft.com/office/drawing/2016/5/12/chartex" xmlns:cx7="http://schemas.microsoft.com/office/drawing/2016/5/13/chartex" xmlns:cx8="http://schemas.microsoft.com/office/drawing/2016/5/14/chartex" xmlns:mc="http://schemas.openxmlformats.org/markup-compatibility/2006" xmlns:aink="http://schemas.microsoft.com/office/drawing/2016/ink" xmlns:am3d="http://schemas.microsoft.com/office/drawing/2017/model3d" xmlns:o="urn:schemas-microsoft-com:office:office" xmlns:oel="http://schemas.microsoft.com/office/2019/extlst" xmlns:r="http://schemas.openxmlformats.org/officeDocument/2006/relationships" xmlns:m="http://schemas.openxmlformats.org/officeDocument/2006/math" xmlns:v="urn:schemas-microsoft-com:vml" xmlns:wp14="http://schemas.microsoft.com/office/word/2010/wordprocessingDrawing" xmlns:wp="http://schemas.openxmlformats.org/drawingml/2006/wordprocessingDrawing" xmlns:w10="urn:schemas-microsoft-com:office:word" xmlns:w="http://schemas.openxmlformats.org/wordprocessingml/2006/main" xmlns:w14="http://schemas.microsoft.com/office/word/2010/wordml" xmlns:w15="http://schemas.microsoft.com/office/word/2012/wordml" xmlns:w16cex="http://schemas.microsoft.com/office/word/2018/wordml/cex" xmlns:w16cid="http://schemas.microsoft.com/office/word/2016/wordml/cid" xmlns:w16="http://schemas.microsoft.com/office/word/2018/wordml" xmlns:w16du="http://schemas.microsoft.com/office/word/2023/wordml/word16du" xmlns:w16sdtdh="http://schemas.microsoft.com/office/word/2020/wordml/sdtdatahash" xmlns:w16sdtfl="http://schemas.microsoft.com/office/word/2024/wordml/sdtformatlock" xmlns:w16se="http://schemas.microsoft.com/office/word/2015/wordml/symex" xmlns:wpg="http://schemas.microsoft.com/office/word/2010/wordprocessingGroup" xmlns:wpi="http://schemas.microsoft.com/office/word/2010/wordprocessingInk" xmlns:wne="http://schemas.microsoft.com/office/word/2006/wordml" xmlns:wps="http://schemas.microsoft.com/office/word/2010/wordprocessingShape" mc:Ignorable="w14 w15 w16se w16cid w16 w16cex w16sdtdh w16sdtfl w16du wp14">
+<w:endnotes xmlns:wpc="http://schemas.microsoft.com/office/word/2010/wordprocessingCanvas" xmlns:cx="http://schemas.microsoft.com/office/drawing/2014/chartex" xmlns:cx1="http://schemas.microsoft.com/office/drawing/2015/9/8/chartex" xmlns:cx2="http://schemas.microsoft.com/office/drawing/2015/10/21/chartex" xmlns:cx3="http://schemas.microsoft.com/office/drawing/2016/5/9/chartex" xmlns:cx4="http://schemas.microsoft.com/office/drawing/2016/5/10/chartex" xmlns:cx5="http://schemas.microsoft.com/office/drawing/2016/5/11/chartex" xmlns:cx6="http://schemas.microsoft.com/office/drawing/2016/5/12/chartex" xmlns:cx7="http://schemas.microsoft.com/office/drawing/2016/5/13/chartex" xmlns:cx8="http://schemas.microsoft.com/office/drawing/2016/5/14/chartex" xmlns:mc="http://schemas.openxmlformats.org/markup-compatibility/2006" xmlns:aink="http://schemas.microsoft.com/office/drawing/2016/ink" xmlns:am3d="http://schemas.microsoft.com/office/drawing/2017/model3d" xmlns:o="urn:schemas-microsoft-com:office:office" xmlns:oel="http://schemas.microsoft.com/office/2019/extlst" xmlns:r="http://schemas.openxmlformats.org/officeDocument/2006/relationships" xmlns:m="http://schemas.openxmlformats.org/officeDocument/2006/math" xmlns:v="urn:schemas-microsoft-com:vml" xmlns:wp14="http://schemas.microsoft.com/office/word/2010/wordprocessingDrawing" xmlns:wp="http://schemas.openxmlformats.org/drawingml/2006/wordprocessingDrawing" xmlns:w10="urn:schemas-microsoft-com:office:word" xmlns:w="http://schemas.openxmlformats.org/wordprocessingml/2006/main" xmlns:w14="http://schemas.microsoft.com/office/word/2010/wordml" xmlns:w15="http://schemas.microsoft.com/office/word/2012/wordml" xmlns:w16cei="http://schemas.microsoft.com/office/word/2026/wordml/cei" xmlns:w16cex="http://schemas.microsoft.com/office/word/2018/wordml/cex" xmlns:w16cid="http://schemas.microsoft.com/office/word/2016/wordml/cid" xmlns:w16="http://schemas.microsoft.com/office/word/2018/wordml" xmlns:w16du="http://schemas.microsoft.com/office/word/2023/wordml/word16du" xmlns:w16sdtdh="http://schemas.microsoft.com/office/word/2020/wordml/sdtdatahash" xmlns:w16sdtfl="http://schemas.microsoft.com/office/word/2024/wordml/sdtformatlock" xmlns:w16se="http://schemas.microsoft.com/office/word/2015/wordml/symex" xmlns:wpg="http://schemas.microsoft.com/office/word/2010/wordprocessingGroup" xmlns:wpi="http://schemas.microsoft.com/office/word/2010/wordprocessingInk" xmlns:wne="http://schemas.microsoft.com/office/word/2006/wordml" xmlns:wps="http://schemas.microsoft.com/office/word/2010/wordprocessingShape" mc:Ignorable="w14 w15 w16se w16cid w16 w16cex w16sdtdh w16sdtfl w16du wp14">
   <w:endnote w:type="separator" w:id="-1">
     <w:p>
       <w:pPr>
@@ -3571,12 +3655,12 @@
 </file>
 
 <file path=word/footer1.xml><?xml version="1.0" encoding="utf-8"?>
-<w:ftr xmlns:wpc="http://schemas.microsoft.com/office/word/2010/wordprocessingCanvas" xmlns:cx="http://schemas.microsoft.com/office/drawing/2014/chartex" xmlns:cx1="http://schemas.microsoft.com/office/drawing/2015/9/8/chartex" xmlns:cx2="http://schemas.microsoft.com/office/drawing/2015/10/21/chartex" xmlns:cx3="http://schemas.microsoft.com/office/drawing/2016/5/9/chartex" xmlns:cx4="http://schemas.microsoft.com/office/drawing/2016/5/10/chartex" xmlns:cx5="http://schemas.microsoft.com/office/drawing/2016/5/11/chartex" xmlns:cx6="http://schemas.microsoft.com/office/drawing/2016/5/12/chartex" xmlns:cx7="http://schemas.microsoft.com/office/drawing/2016/5/13/chartex" xmlns:cx8="http://schemas.microsoft.com/office/drawing/2016/5/14/chartex" xmlns:mc="http://schemas.openxmlformats.org/markup-compatibility/2006" xmlns:aink="http://schemas.microsoft.com/office/drawing/2016/ink" xmlns:am3d="http://schemas.microsoft.com/office/drawing/2017/model3d" xmlns:o="urn:schemas-microsoft-com:office:office" xmlns:oel="http://schemas.microsoft.com/office/2019/extlst" xmlns:r="http://schemas.openxmlformats.org/officeDocument/2006/relationships" xmlns:m="http://schemas.openxmlformats.org/officeDocument/2006/math" xmlns:v="urn:schemas-microsoft-com:vml" xmlns:wp14="http://schemas.microsoft.com/office/word/2010/wordprocessingDrawing" xmlns:wp="http://schemas.openxmlformats.org/drawingml/2006/wordprocessingDrawing" xmlns:w10="urn:schemas-microsoft-com:office:word" xmlns:w="http://schemas.openxmlformats.org/wordprocessingml/2006/main" xmlns:w14="http://schemas.microsoft.com/office/word/2010/wordml" xmlns:w15="http://schemas.microsoft.com/office/word/2012/wordml" xmlns:w16cex="http://schemas.microsoft.com/office/word/2018/wordml/cex" xmlns:w16cid="http://schemas.microsoft.com/office/word/2016/wordml/cid" xmlns:w16="http://schemas.microsoft.com/office/word/2018/wordml" xmlns:w16du="http://schemas.microsoft.com/office/word/2023/wordml/word16du" xmlns:w16sdtdh="http://schemas.microsoft.com/office/word/2020/wordml/sdtdatahash" xmlns:w16sdtfl="http://schemas.microsoft.com/office/word/2024/wordml/sdtformatlock" xmlns:w16se="http://schemas.microsoft.com/office/word/2015/wordml/symex" xmlns:wpg="http://schemas.microsoft.com/office/word/2010/wordprocessingGroup" xmlns:wpi="http://schemas.microsoft.com/office/word/2010/wordprocessingInk" xmlns:wne="http://schemas.microsoft.com/office/word/2006/wordml" xmlns:wps="http://schemas.microsoft.com/office/word/2010/wordprocessingShape" mc:Ignorable="w14 w15 w16se w16cid w16 w16cex w16sdtdh w16sdtfl w16du wp14">
+<w:ftr xmlns:wpc="http://schemas.microsoft.com/office/word/2010/wordprocessingCanvas" xmlns:cx="http://schemas.microsoft.com/office/drawing/2014/chartex" xmlns:cx1="http://schemas.microsoft.com/office/drawing/2015/9/8/chartex" xmlns:cx2="http://schemas.microsoft.com/office/drawing/2015/10/21/chartex" xmlns:cx3="http://schemas.microsoft.com/office/drawing/2016/5/9/chartex" xmlns:cx4="http://schemas.microsoft.com/office/drawing/2016/5/10/chartex" xmlns:cx5="http://schemas.microsoft.com/office/drawing/2016/5/11/chartex" xmlns:cx6="http://schemas.microsoft.com/office/drawing/2016/5/12/chartex" xmlns:cx7="http://schemas.microsoft.com/office/drawing/2016/5/13/chartex" xmlns:cx8="http://schemas.microsoft.com/office/drawing/2016/5/14/chartex" xmlns:mc="http://schemas.openxmlformats.org/markup-compatibility/2006" xmlns:aink="http://schemas.microsoft.com/office/drawing/2016/ink" xmlns:am3d="http://schemas.microsoft.com/office/drawing/2017/model3d" xmlns:o="urn:schemas-microsoft-com:office:office" xmlns:oel="http://schemas.microsoft.com/office/2019/extlst" xmlns:r="http://schemas.openxmlformats.org/officeDocument/2006/relationships" xmlns:m="http://schemas.openxmlformats.org/officeDocument/2006/math" xmlns:v="urn:schemas-microsoft-com:vml" xmlns:wp14="http://schemas.microsoft.com/office/word/2010/wordprocessingDrawing" xmlns:wp="http://schemas.openxmlformats.org/drawingml/2006/wordprocessingDrawing" xmlns:w10="urn:schemas-microsoft-com:office:word" xmlns:w="http://schemas.openxmlformats.org/wordprocessingml/2006/main" xmlns:w14="http://schemas.microsoft.com/office/word/2010/wordml" xmlns:w15="http://schemas.microsoft.com/office/word/2012/wordml" xmlns:w16cei="http://schemas.microsoft.com/office/word/2026/wordml/cei" xmlns:w16cex="http://schemas.microsoft.com/office/word/2018/wordml/cex" xmlns:w16cid="http://schemas.microsoft.com/office/word/2016/wordml/cid" xmlns:w16="http://schemas.microsoft.com/office/word/2018/wordml" xmlns:w16du="http://schemas.microsoft.com/office/word/2023/wordml/word16du" xmlns:w16sdtdh="http://schemas.microsoft.com/office/word/2020/wordml/sdtdatahash" xmlns:w16sdtfl="http://schemas.microsoft.com/office/word/2024/wordml/sdtformatlock" xmlns:w16se="http://schemas.microsoft.com/office/word/2015/wordml/symex" xmlns:wpg="http://schemas.microsoft.com/office/word/2010/wordprocessingGroup" xmlns:wpi="http://schemas.microsoft.com/office/word/2010/wordprocessingInk" xmlns:wne="http://schemas.microsoft.com/office/word/2006/wordml" xmlns:wps="http://schemas.microsoft.com/office/word/2010/wordprocessingShape" mc:Ignorable="w14 w15 w16se w16cid w16 w16cex w16sdtdh w16sdtfl w16du wp14">
   <w:p>
     <w:pPr>
       <w:pStyle w:val="Piedepagina"/>
       <w:pBdr>
-        <w:top w:val="single" w:color="D6DCE4" w:sz="4" w:space="6"/>
+        <w:top w:val="single" w:sz="4" w:space="6" w:color="D6DCE4"/>
       </w:pBdr>
       <w:tabs>
         <w:tab w:val="right" w:pos="9360"/>
@@ -3587,8 +3671,6 @@
     </w:r>
     <w:r>
       <w:tab/>
-    </w:r>
-    <w:r>
       <w:t xml:space="preserve">Página </w:t>
     </w:r>
     <w:r>
@@ -3635,7 +3717,7 @@
 </file>
 
 <file path=word/footnotes.xml><?xml version="1.0" encoding="utf-8"?>
-<w:footnotes xmlns:wpc="http://schemas.microsoft.com/office/word/2010/wordprocessingCanvas" xmlns:cx="http://schemas.microsoft.com/office/drawing/2014/chartex" xmlns:cx1="http://schemas.microsoft.com/office/drawing/2015/9/8/chartex" xmlns:cx2="http://schemas.microsoft.com/office/drawing/2015/10/21/chartex" xmlns:cx3="http://schemas.microsoft.com/office/drawing/2016/5/9/chartex" xmlns:cx4="http://schemas.microsoft.com/office/drawing/2016/5/10/chartex" xmlns:cx5="http://schemas.microsoft.com/office/drawing/2016/5/11/chartex" xmlns:cx6="http://schemas.microsoft.com/office/drawing/2016/5/12/chartex" xmlns:cx7="http://schemas.microsoft.com/office/drawing/2016/5/13/chartex" xmlns:cx8="http://schemas.microsoft.com/office/drawing/2016/5/14/chartex" xmlns:mc="http://schemas.openxmlformats.org/markup-compatibility/2006" xmlns:aink="http://schemas.microsoft.com/office/drawing/2016/ink" xmlns:am3d="http://schemas.microsoft.com/office/drawing/2017/model3d" xmlns:o="urn:schemas-microsoft-com:office:office" xmlns:oel="http://schemas.microsoft.com/office/2019/extlst" xmlns:r="http://schemas.openxmlformats.org/officeDocument/2006/relationships" xmlns:m="http://schemas.openxmlformats.org/officeDocument/2006/math" xmlns:v="urn:schemas-microsoft-com:vml" xmlns:wp14="http://schemas.microsoft.com/office/word/2010/wordprocessingDrawing" xmlns:wp="http://schemas.openxmlformats.org/drawingml/2006/wordprocessingDrawing" xmlns:w10="urn:schemas-microsoft-com:office:word" xmlns:w="http://schemas.openxmlformats.org/wordprocessingml/2006/main" xmlns:w14="http://schemas.microsoft.com/office/word/2010/wordml" xmlns:w15="http://schemas.microsoft.com/office/word/2012/wordml" xmlns:w16cex="http://schemas.microsoft.com/office/word/2018/wordml/cex" xmlns:w16cid="http://schemas.microsoft.com/office/word/2016/wordml/cid" xmlns:w16="http://schemas.microsoft.com/office/word/2018/wordml" xmlns:w16du="http://schemas.microsoft.com/office/word/2023/wordml/word16du" xmlns:w16sdtdh="http://schemas.microsoft.com/office/word/2020/wordml/sdtdatahash" xmlns:w16sdtfl="http://schemas.microsoft.com/office/word/2024/wordml/sdtformatlock" xmlns:w16se="http://schemas.microsoft.com/office/word/2015/wordml/symex" xmlns:wpg="http://schemas.microsoft.com/office/word/2010/wordprocessingGroup" xmlns:wpi="http://schemas.microsoft.com/office/word/2010/wordprocessingInk" xmlns:wne="http://schemas.microsoft.com/office/word/2006/wordml" xmlns:wps="http://schemas.microsoft.com/office/word/2010/wordprocessingShape" mc:Ignorable="w14 w15 w16se w16cid w16 w16cex w16sdtdh w16sdtfl w16du wp14">
+<w:footnotes xmlns:wpc="http://schemas.microsoft.com/office/word/2010/wordprocessingCanvas" xmlns:cx="http://schemas.microsoft.com/office/drawing/2014/chartex" xmlns:cx1="http://schemas.microsoft.com/office/drawing/2015/9/8/chartex" xmlns:cx2="http://schemas.microsoft.com/office/drawing/2015/10/21/chartex" xmlns:cx3="http://schemas.microsoft.com/office/drawing/2016/5/9/chartex" xmlns:cx4="http://schemas.microsoft.com/office/drawing/2016/5/10/chartex" xmlns:cx5="http://schemas.microsoft.com/office/drawing/2016/5/11/chartex" xmlns:cx6="http://schemas.microsoft.com/office/drawing/2016/5/12/chartex" xmlns:cx7="http://schemas.microsoft.com/office/drawing/2016/5/13/chartex" xmlns:cx8="http://schemas.microsoft.com/office/drawing/2016/5/14/chartex" xmlns:mc="http://schemas.openxmlformats.org/markup-compatibility/2006" xmlns:aink="http://schemas.microsoft.com/office/drawing/2016/ink" xmlns:am3d="http://schemas.microsoft.com/office/drawing/2017/model3d" xmlns:o="urn:schemas-microsoft-com:office:office" xmlns:oel="http://schemas.microsoft.com/office/2019/extlst" xmlns:r="http://schemas.openxmlformats.org/officeDocument/2006/relationships" xmlns:m="http://schemas.openxmlformats.org/officeDocument/2006/math" xmlns:v="urn:schemas-microsoft-com:vml" xmlns:wp14="http://schemas.microsoft.com/office/word/2010/wordprocessingDrawing" xmlns:wp="http://schemas.openxmlformats.org/drawingml/2006/wordprocessingDrawing" xmlns:w10="urn:schemas-microsoft-com:office:word" xmlns:w="http://schemas.openxmlformats.org/wordprocessingml/2006/main" xmlns:w14="http://schemas.microsoft.com/office/word/2010/wordml" xmlns:w15="http://schemas.microsoft.com/office/word/2012/wordml" xmlns:w16cei="http://schemas.microsoft.com/office/word/2026/wordml/cei" xmlns:w16cex="http://schemas.microsoft.com/office/word/2018/wordml/cex" xmlns:w16cid="http://schemas.microsoft.com/office/word/2016/wordml/cid" xmlns:w16="http://schemas.microsoft.com/office/word/2018/wordml" xmlns:w16du="http://schemas.microsoft.com/office/word/2023/wordml/word16du" xmlns:w16sdtdh="http://schemas.microsoft.com/office/word/2020/wordml/sdtdatahash" xmlns:w16sdtfl="http://schemas.microsoft.com/office/word/2024/wordml/sdtformatlock" xmlns:w16se="http://schemas.microsoft.com/office/word/2015/wordml/symex" xmlns:wpg="http://schemas.microsoft.com/office/word/2010/wordprocessingGroup" xmlns:wpi="http://schemas.microsoft.com/office/word/2010/wordprocessingInk" xmlns:wne="http://schemas.microsoft.com/office/word/2006/wordml" xmlns:wps="http://schemas.microsoft.com/office/word/2010/wordprocessingShape" mc:Ignorable="w14 w15 w16se w16cid w16 w16cex w16sdtdh w16sdtfl w16du wp14">
   <w:footnote w:type="separator" w:id="-1">
     <w:p>
       <w:pPr>
@@ -3660,7 +3742,7 @@
 </file>
 
 <file path=word/numbering.xml><?xml version="1.0" encoding="utf-8"?>
-<w:numbering xmlns:wpc="http://schemas.microsoft.com/office/word/2010/wordprocessingCanvas" xmlns:cx="http://schemas.microsoft.com/office/drawing/2014/chartex" xmlns:cx1="http://schemas.microsoft.com/office/drawing/2015/9/8/chartex" xmlns:cx2="http://schemas.microsoft.com/office/drawing/2015/10/21/chartex" xmlns:cx3="http://schemas.microsoft.com/office/drawing/2016/5/9/chartex" xmlns:cx4="http://schemas.microsoft.com/office/drawing/2016/5/10/chartex" xmlns:cx5="http://schemas.microsoft.com/office/drawing/2016/5/11/chartex" xmlns:cx6="http://schemas.microsoft.com/office/drawing/2016/5/12/chartex" xmlns:cx7="http://schemas.microsoft.com/office/drawing/2016/5/13/chartex" xmlns:cx8="http://schemas.microsoft.com/office/drawing/2016/5/14/chartex" xmlns:mc="http://schemas.openxmlformats.org/markup-compatibility/2006" xmlns:aink="http://schemas.microsoft.com/office/drawing/2016/ink" xmlns:am3d="http://schemas.microsoft.com/office/drawing/2017/model3d" xmlns:o="urn:schemas-microsoft-com:office:office" xmlns:oel="http://schemas.microsoft.com/office/2019/extlst" xmlns:r="http://schemas.openxmlformats.org/officeDocument/2006/relationships" xmlns:m="http://schemas.openxmlformats.org/officeDocument/2006/math" xmlns:v="urn:schemas-microsoft-com:vml" xmlns:wp14="http://schemas.microsoft.com/office/word/2010/wordprocessingDrawing" xmlns:wp="http://schemas.openxmlformats.org/drawingml/2006/wordprocessingDrawing" xmlns:w10="urn:schemas-microsoft-com:office:word" xmlns:w="http://schemas.openxmlformats.org/wordprocessingml/2006/main" xmlns:w14="http://schemas.microsoft.com/office/word/2010/wordml" xmlns:w15="http://schemas.microsoft.com/office/word/2012/wordml" xmlns:w16cex="http://schemas.microsoft.com/office/word/2018/wordml/cex" xmlns:w16cid="http://schemas.microsoft.com/office/word/2016/wordml/cid" xmlns:w16="http://schemas.microsoft.com/office/word/2018/wordml" xmlns:w16du="http://schemas.microsoft.com/office/word/2023/wordml/word16du" xmlns:w16sdtdh="http://schemas.microsoft.com/office/word/2020/wordml/sdtdatahash" xmlns:w16sdtfl="http://schemas.microsoft.com/office/word/2024/wordml/sdtformatlock" xmlns:w16se="http://schemas.microsoft.com/office/word/2015/wordml/symex" xmlns:wpg="http://schemas.microsoft.com/office/word/2010/wordprocessingGroup" xmlns:wpi="http://schemas.microsoft.com/office/word/2010/wordprocessingInk" xmlns:wne="http://schemas.microsoft.com/office/word/2006/wordml" xmlns:wps="http://schemas.microsoft.com/office/word/2010/wordprocessingShape" mc:Ignorable="w14 w15 w16se w16cid w16 w16cex w16sdtdh w16sdtfl w16du wp14">
+<w:numbering xmlns:wpc="http://schemas.microsoft.com/office/word/2010/wordprocessingCanvas" xmlns:cx="http://schemas.microsoft.com/office/drawing/2014/chartex" xmlns:cx1="http://schemas.microsoft.com/office/drawing/2015/9/8/chartex" xmlns:cx2="http://schemas.microsoft.com/office/drawing/2015/10/21/chartex" xmlns:cx3="http://schemas.microsoft.com/office/drawing/2016/5/9/chartex" xmlns:cx4="http://schemas.microsoft.com/office/drawing/2016/5/10/chartex" xmlns:cx5="http://schemas.microsoft.com/office/drawing/2016/5/11/chartex" xmlns:cx6="http://schemas.microsoft.com/office/drawing/2016/5/12/chartex" xmlns:cx7="http://schemas.microsoft.com/office/drawing/2016/5/13/chartex" xmlns:cx8="http://schemas.microsoft.com/office/drawing/2016/5/14/chartex" xmlns:mc="http://schemas.openxmlformats.org/markup-compatibility/2006" xmlns:aink="http://schemas.microsoft.com/office/drawing/2016/ink" xmlns:am3d="http://schemas.microsoft.com/office/drawing/2017/model3d" xmlns:o="urn:schemas-microsoft-com:office:office" xmlns:oel="http://schemas.microsoft.com/office/2019/extlst" xmlns:r="http://schemas.openxmlformats.org/officeDocument/2006/relationships" xmlns:m="http://schemas.openxmlformats.org/officeDocument/2006/math" xmlns:v="urn:schemas-microsoft-com:vml" xmlns:wp14="http://schemas.microsoft.com/office/word/2010/wordprocessingDrawing" xmlns:wp="http://schemas.openxmlformats.org/drawingml/2006/wordprocessingDrawing" xmlns:w10="urn:schemas-microsoft-com:office:word" xmlns:w="http://schemas.openxmlformats.org/wordprocessingml/2006/main" xmlns:w14="http://schemas.microsoft.com/office/word/2010/wordml" xmlns:w15="http://schemas.microsoft.com/office/word/2012/wordml" xmlns:w16cei="http://schemas.microsoft.com/office/word/2026/wordml/cei" xmlns:w16cex="http://schemas.microsoft.com/office/word/2018/wordml/cex" xmlns:w16cid="http://schemas.microsoft.com/office/word/2016/wordml/cid" xmlns:w16="http://schemas.microsoft.com/office/word/2018/wordml" xmlns:w16du="http://schemas.microsoft.com/office/word/2023/wordml/word16du" xmlns:w16sdtdh="http://schemas.microsoft.com/office/word/2020/wordml/sdtdatahash" xmlns:w16sdtfl="http://schemas.microsoft.com/office/word/2024/wordml/sdtformatlock" xmlns:w16se="http://schemas.microsoft.com/office/word/2015/wordml/symex" xmlns:wpg="http://schemas.microsoft.com/office/word/2010/wordprocessingGroup" xmlns:wpi="http://schemas.microsoft.com/office/word/2010/wordprocessingInk" xmlns:wne="http://schemas.microsoft.com/office/word/2006/wordml" xmlns:wps="http://schemas.microsoft.com/office/word/2010/wordprocessingShape" mc:Ignorable="w14 w15 w16se w16cid w16 w16cex w16sdtdh w16sdtfl w16du wp14">
   <w:abstractNum w:abstractNumId="0" w15:restartNumberingAfterBreak="0">
     <w:nsid w:val="055A6B14"/>
     <w:multiLevelType w:val="hybridMultilevel"/>
@@ -3674,7 +3756,7 @@
         <w:ind w:left="520" w:hanging="360"/>
       </w:pPr>
       <w:rPr>
-        <w:rFonts w:ascii="Calibri" w:hAnsi="Calibri" w:eastAsia="Calibri" w:cs="Calibri"/>
+        <w:rFonts w:ascii="Calibri" w:eastAsia="Calibri" w:hAnsi="Calibri" w:cs="Calibri"/>
         <w:b/>
         <w:bCs/>
         <w:color w:val="1E7A46"/>
@@ -3820,7 +3902,7 @@
         <w:ind w:left="520" w:hanging="360"/>
       </w:pPr>
       <w:rPr>
-        <w:rFonts w:ascii="Calibri" w:hAnsi="Calibri" w:eastAsia="Calibri" w:cs="Calibri"/>
+        <w:rFonts w:ascii="Calibri" w:eastAsia="Calibri" w:hAnsi="Calibri" w:cs="Calibri"/>
         <w:b/>
         <w:bCs/>
         <w:color w:val="2E74B5"/>
@@ -3880,7 +3962,7 @@
         <w:ind w:left="460" w:hanging="260"/>
       </w:pPr>
       <w:rPr>
-        <w:rFonts w:ascii="Calibri" w:hAnsi="Calibri" w:eastAsia="Calibri" w:cs="Calibri"/>
+        <w:rFonts w:ascii="Calibri" w:eastAsia="Calibri" w:hAnsi="Calibri" w:cs="Calibri"/>
         <w:color w:val="2E74B5"/>
       </w:rPr>
     </w:lvl>
@@ -4032,41 +4114,62 @@
       <w:startOverride w:val="1"/>
     </w:lvlOverride>
   </w:num>
-  <w:num w:numId="20">
+  <w:num w:numId="9" w16cid:durableId="1153717671">
     <w:abstractNumId w:val="3"/>
+    <w:lvlOverride w:ilvl="0">
+      <w:startOverride w:val="1"/>
+    </w:lvlOverride>
   </w:num>
-  <w:num w:numId="21">
+  <w:num w:numId="10" w16cid:durableId="1438284593">
     <w:abstractNumId w:val="3"/>
+    <w:lvlOverride w:ilvl="0">
+      <w:startOverride w:val="1"/>
+    </w:lvlOverride>
   </w:num>
-  <w:num w:numId="22">
+  <w:num w:numId="11" w16cid:durableId="320697703">
     <w:abstractNumId w:val="4"/>
+    <w:lvlOverride w:ilvl="0">
+      <w:startOverride w:val="1"/>
+    </w:lvlOverride>
   </w:num>
-  <w:num w:numId="23">
+  <w:num w:numId="12" w16cid:durableId="1801025950">
     <w:abstractNumId w:val="3"/>
+    <w:lvlOverride w:ilvl="0">
+      <w:startOverride w:val="1"/>
+    </w:lvlOverride>
   </w:num>
-  <w:num w:numId="24">
+  <w:num w:numId="13" w16cid:durableId="937634879">
     <w:abstractNumId w:val="3"/>
+    <w:lvlOverride w:ilvl="0">
+      <w:startOverride w:val="1"/>
+    </w:lvlOverride>
   </w:num>
-  <w:num w:numId="25">
+  <w:num w:numId="14" w16cid:durableId="1973945915">
     <w:abstractNumId w:val="4"/>
+    <w:lvlOverride w:ilvl="0">
+      <w:startOverride w:val="1"/>
+    </w:lvlOverride>
   </w:num>
 </w:numbering>
 </file>
 
 <file path=word/people.xml><?xml version="1.0" encoding="utf-8"?>
-<w15:people xmlns:wpc="http://schemas.microsoft.com/office/word/2010/wordprocessingCanvas" xmlns:cx="http://schemas.microsoft.com/office/drawing/2014/chartex" xmlns:cx1="http://schemas.microsoft.com/office/drawing/2015/9/8/chartex" xmlns:cx2="http://schemas.microsoft.com/office/drawing/2015/10/21/chartex" xmlns:cx3="http://schemas.microsoft.com/office/drawing/2016/5/9/chartex" xmlns:cx4="http://schemas.microsoft.com/office/drawing/2016/5/10/chartex" xmlns:cx5="http://schemas.microsoft.com/office/drawing/2016/5/11/chartex" xmlns:cx6="http://schemas.microsoft.com/office/drawing/2016/5/12/chartex" xmlns:cx7="http://schemas.microsoft.com/office/drawing/2016/5/13/chartex" xmlns:cx8="http://schemas.microsoft.com/office/drawing/2016/5/14/chartex" xmlns:mc="http://schemas.openxmlformats.org/markup-compatibility/2006" xmlns:aink="http://schemas.microsoft.com/office/drawing/2016/ink" xmlns:am3d="http://schemas.microsoft.com/office/drawing/2017/model3d" xmlns:o="urn:schemas-microsoft-com:office:office" xmlns:oel="http://schemas.microsoft.com/office/2019/extlst" xmlns:r="http://schemas.openxmlformats.org/officeDocument/2006/relationships" xmlns:m="http://schemas.openxmlformats.org/officeDocument/2006/math" xmlns:v="urn:schemas-microsoft-com:vml" xmlns:wp14="http://schemas.microsoft.com/office/word/2010/wordprocessingDrawing" xmlns:wp="http://schemas.openxmlformats.org/drawingml/2006/wordprocessingDrawing" xmlns:w10="urn:schemas-microsoft-com:office:word" xmlns:w="http://schemas.openxmlformats.org/wordprocessingml/2006/main" xmlns:w14="http://schemas.microsoft.com/office/word/2010/wordml" xmlns:w15="http://schemas.microsoft.com/office/word/2012/wordml" xmlns:w16cex="http://schemas.microsoft.com/office/word/2018/wordml/cex" xmlns:w16cid="http://schemas.microsoft.com/office/word/2016/wordml/cid" xmlns:w16="http://schemas.microsoft.com/office/word/2018/wordml" xmlns:w16du="http://schemas.microsoft.com/office/word/2023/wordml/word16du" xmlns:w16sdtdh="http://schemas.microsoft.com/office/word/2020/wordml/sdtdatahash" xmlns:w16sdtfl="http://schemas.microsoft.com/office/word/2024/wordml/sdtformatlock" xmlns:w16se="http://schemas.microsoft.com/office/word/2015/wordml/symex" xmlns:wpg="http://schemas.microsoft.com/office/word/2010/wordprocessingGroup" xmlns:wpi="http://schemas.microsoft.com/office/word/2010/wordprocessingInk" xmlns:wne="http://schemas.microsoft.com/office/word/2006/wordml" xmlns:wps="http://schemas.microsoft.com/office/word/2010/wordprocessingShape" mc:Ignorable="w14 w15 w16se w16cid w16 w16cex w16sdtdh w16sdtfl w16du wp14">
+<w15:people xmlns:wpc="http://schemas.microsoft.com/office/word/2010/wordprocessingCanvas" xmlns:cx="http://schemas.microsoft.com/office/drawing/2014/chartex" xmlns:cx1="http://schemas.microsoft.com/office/drawing/2015/9/8/chartex" xmlns:cx2="http://schemas.microsoft.com/office/drawing/2015/10/21/chartex" xmlns:cx3="http://schemas.microsoft.com/office/drawing/2016/5/9/chartex" xmlns:cx4="http://schemas.microsoft.com/office/drawing/2016/5/10/chartex" xmlns:cx5="http://schemas.microsoft.com/office/drawing/2016/5/11/chartex" xmlns:cx6="http://schemas.microsoft.com/office/drawing/2016/5/12/chartex" xmlns:cx7="http://schemas.microsoft.com/office/drawing/2016/5/13/chartex" xmlns:cx8="http://schemas.microsoft.com/office/drawing/2016/5/14/chartex" xmlns:mc="http://schemas.openxmlformats.org/markup-compatibility/2006" xmlns:aink="http://schemas.microsoft.com/office/drawing/2016/ink" xmlns:am3d="http://schemas.microsoft.com/office/drawing/2017/model3d" xmlns:o="urn:schemas-microsoft-com:office:office" xmlns:oel="http://schemas.microsoft.com/office/2019/extlst" xmlns:r="http://schemas.openxmlformats.org/officeDocument/2006/relationships" xmlns:m="http://schemas.openxmlformats.org/officeDocument/2006/math" xmlns:v="urn:schemas-microsoft-com:vml" xmlns:wp14="http://schemas.microsoft.com/office/word/2010/wordprocessingDrawing" xmlns:wp="http://schemas.openxmlformats.org/drawingml/2006/wordprocessingDrawing" xmlns:w10="urn:schemas-microsoft-com:office:word" xmlns:w="http://schemas.openxmlformats.org/wordprocessingml/2006/main" xmlns:w14="http://schemas.microsoft.com/office/word/2010/wordml" xmlns:w15="http://schemas.microsoft.com/office/word/2012/wordml" xmlns:w16cei="http://schemas.microsoft.com/office/word/2026/wordml/cei" xmlns:w16cex="http://schemas.microsoft.com/office/word/2018/wordml/cex" xmlns:w16cid="http://schemas.microsoft.com/office/word/2016/wordml/cid" xmlns:w16="http://schemas.microsoft.com/office/word/2018/wordml" xmlns:w16du="http://schemas.microsoft.com/office/word/2023/wordml/word16du" xmlns:w16sdtdh="http://schemas.microsoft.com/office/word/2020/wordml/sdtdatahash" xmlns:w16sdtfl="http://schemas.microsoft.com/office/word/2024/wordml/sdtformatlock" xmlns:w16se="http://schemas.microsoft.com/office/word/2015/wordml/symex" xmlns:wpg="http://schemas.microsoft.com/office/word/2010/wordprocessingGroup" xmlns:wpi="http://schemas.microsoft.com/office/word/2010/wordprocessingInk" xmlns:wne="http://schemas.microsoft.com/office/word/2006/wordml" xmlns:wps="http://schemas.microsoft.com/office/word/2010/wordprocessingShape" mc:Ignorable="w14 w15 w16se w16cid w16 w16cex w16sdtdh w16sdtfl w16du wp14">
   <w15:person w15:author="Sergio Andres Flores Olivares">
     <w15:presenceInfo w15:providerId="AD" w15:userId="S::safloreso@GRUPOCGE.CL::5a712a50-a7c4-4d2a-a547-b5fd4ca77c74"/>
+  </w15:person>
+  <w15:person w15:author="Emerson Garrido Villarroel">
+    <w15:presenceInfo w15:providerId="AD" w15:userId="S::egarridov@GRUPOCGE.CL::03084442-ff00-4a71-8f01-f1d8394d98cf"/>
   </w15:person>
 </w15:people>
 </file>
 
 <file path=word/styles.xml><?xml version="1.0" encoding="utf-8"?>
-<w:styles xmlns:wp14="http://schemas.microsoft.com/office/word/2010/wordprocessingDrawing" xmlns:mc="http://schemas.openxmlformats.org/markup-compatibility/2006" xmlns:r="http://schemas.openxmlformats.org/officeDocument/2006/relationships" xmlns:w="http://schemas.openxmlformats.org/wordprocessingml/2006/main" xmlns:w14="http://schemas.microsoft.com/office/word/2010/wordml" xmlns:w15="http://schemas.microsoft.com/office/word/2012/wordml" xmlns:w16cex="http://schemas.microsoft.com/office/word/2018/wordml/cex" xmlns:w16cid="http://schemas.microsoft.com/office/word/2016/wordml/cid" xmlns:w16="http://schemas.microsoft.com/office/word/2018/wordml" xmlns:w16du="http://schemas.microsoft.com/office/word/2023/wordml/word16du" xmlns:w16sdtdh="http://schemas.microsoft.com/office/word/2020/wordml/sdtdatahash" xmlns:w16sdtfl="http://schemas.microsoft.com/office/word/2024/wordml/sdtformatlock" xmlns:w16se="http://schemas.microsoft.com/office/word/2015/wordml/symex" mc:Ignorable="w14 w15 w16se w16cid w16 w16cex w16sdtdh w16sdtfl w16du wp14">
+<w:styles xmlns:mc="http://schemas.openxmlformats.org/markup-compatibility/2006" xmlns:r="http://schemas.openxmlformats.org/officeDocument/2006/relationships" xmlns:w="http://schemas.openxmlformats.org/wordprocessingml/2006/main" xmlns:w14="http://schemas.microsoft.com/office/word/2010/wordml" xmlns:w15="http://schemas.microsoft.com/office/word/2012/wordml" xmlns:w16cex="http://schemas.microsoft.com/office/word/2018/wordml/cex" xmlns:w16cid="http://schemas.microsoft.com/office/word/2016/wordml/cid" xmlns:w16="http://schemas.microsoft.com/office/word/2018/wordml" xmlns:w16du="http://schemas.microsoft.com/office/word/2023/wordml/word16du" xmlns:w16sdtdh="http://schemas.microsoft.com/office/word/2020/wordml/sdtdatahash" xmlns:w16sdtfl="http://schemas.microsoft.com/office/word/2024/wordml/sdtformatlock" xmlns:w16se="http://schemas.microsoft.com/office/word/2015/wordml/symex" mc:Ignorable="w14 w15 w16se w16cid w16 w16cex w16sdtdh w16sdtfl w16du">
   <w:docDefaults>
     <w:rPrDefault>
       <w:rPr>
-        <w:rFonts w:ascii="Calibri" w:hAnsi="Calibri" w:eastAsia="Calibri" w:cs="Calibri"/>
+        <w:rFonts w:ascii="Calibri" w:eastAsia="Calibri" w:hAnsi="Calibri" w:cs="Calibri"/>
         <w:color w:val="262626"/>
         <w:sz w:val="22"/>
         <w:szCs w:val="22"/>
@@ -4082,14 +4185,14 @@
   <w:latentStyles w:defLockedState="0" w:defUIPriority="99" w:defSemiHidden="0" w:defUnhideWhenUsed="0" w:defQFormat="0" w:count="376">
     <w:lsdException w:name="Normal" w:uiPriority="0" w:qFormat="1"/>
     <w:lsdException w:name="heading 1" w:uiPriority="9" w:qFormat="1"/>
-    <w:lsdException w:name="heading 2" w:uiPriority="9" w:semiHidden="1" w:unhideWhenUsed="1" w:qFormat="1"/>
-    <w:lsdException w:name="heading 3" w:uiPriority="9" w:semiHidden="1" w:unhideWhenUsed="1" w:qFormat="1"/>
-    <w:lsdException w:name="heading 4" w:uiPriority="9" w:semiHidden="1" w:unhideWhenUsed="1" w:qFormat="1"/>
-    <w:lsdException w:name="heading 5" w:uiPriority="9" w:semiHidden="1" w:unhideWhenUsed="1" w:qFormat="1"/>
-    <w:lsdException w:name="heading 6" w:uiPriority="9" w:semiHidden="1" w:unhideWhenUsed="1" w:qFormat="1"/>
-    <w:lsdException w:name="heading 7" w:uiPriority="9" w:semiHidden="1" w:unhideWhenUsed="1" w:qFormat="1"/>
-    <w:lsdException w:name="heading 8" w:uiPriority="9" w:semiHidden="1" w:unhideWhenUsed="1" w:qFormat="1"/>
-    <w:lsdException w:name="heading 9" w:uiPriority="9" w:semiHidden="1" w:unhideWhenUsed="1" w:qFormat="1"/>
+    <w:lsdException w:name="heading 2" w:semiHidden="1" w:uiPriority="9" w:unhideWhenUsed="1" w:qFormat="1"/>
+    <w:lsdException w:name="heading 3" w:semiHidden="1" w:uiPriority="9" w:unhideWhenUsed="1" w:qFormat="1"/>
+    <w:lsdException w:name="heading 4" w:semiHidden="1" w:uiPriority="9" w:unhideWhenUsed="1" w:qFormat="1"/>
+    <w:lsdException w:name="heading 5" w:semiHidden="1" w:uiPriority="9" w:unhideWhenUsed="1" w:qFormat="1"/>
+    <w:lsdException w:name="heading 6" w:semiHidden="1" w:uiPriority="9" w:unhideWhenUsed="1" w:qFormat="1"/>
+    <w:lsdException w:name="heading 7" w:semiHidden="1" w:uiPriority="9" w:unhideWhenUsed="1" w:qFormat="1"/>
+    <w:lsdException w:name="heading 8" w:semiHidden="1" w:uiPriority="9" w:unhideWhenUsed="1" w:qFormat="1"/>
+    <w:lsdException w:name="heading 9" w:semiHidden="1" w:uiPriority="9" w:unhideWhenUsed="1" w:qFormat="1"/>
     <w:lsdException w:name="index 1" w:semiHidden="1" w:unhideWhenUsed="1"/>
     <w:lsdException w:name="index 2" w:semiHidden="1" w:unhideWhenUsed="1"/>
     <w:lsdException w:name="index 3" w:semiHidden="1" w:unhideWhenUsed="1"/>
@@ -4099,22 +4202,22 @@
     <w:lsdException w:name="index 7" w:semiHidden="1" w:unhideWhenUsed="1"/>
     <w:lsdException w:name="index 8" w:semiHidden="1" w:unhideWhenUsed="1"/>
     <w:lsdException w:name="index 9" w:semiHidden="1" w:unhideWhenUsed="1"/>
-    <w:lsdException w:name="toc 1" w:uiPriority="39" w:semiHidden="1" w:unhideWhenUsed="1"/>
-    <w:lsdException w:name="toc 2" w:uiPriority="39" w:semiHidden="1" w:unhideWhenUsed="1"/>
-    <w:lsdException w:name="toc 3" w:uiPriority="39" w:semiHidden="1" w:unhideWhenUsed="1"/>
-    <w:lsdException w:name="toc 4" w:uiPriority="39" w:semiHidden="1" w:unhideWhenUsed="1"/>
-    <w:lsdException w:name="toc 5" w:uiPriority="39" w:semiHidden="1" w:unhideWhenUsed="1"/>
-    <w:lsdException w:name="toc 6" w:uiPriority="39" w:semiHidden="1" w:unhideWhenUsed="1"/>
-    <w:lsdException w:name="toc 7" w:uiPriority="39" w:semiHidden="1" w:unhideWhenUsed="1"/>
-    <w:lsdException w:name="toc 8" w:uiPriority="39" w:semiHidden="1" w:unhideWhenUsed="1"/>
-    <w:lsdException w:name="toc 9" w:uiPriority="39" w:semiHidden="1" w:unhideWhenUsed="1"/>
+    <w:lsdException w:name="toc 1" w:semiHidden="1" w:uiPriority="39" w:unhideWhenUsed="1"/>
+    <w:lsdException w:name="toc 2" w:semiHidden="1" w:uiPriority="39" w:unhideWhenUsed="1"/>
+    <w:lsdException w:name="toc 3" w:semiHidden="1" w:uiPriority="39" w:unhideWhenUsed="1"/>
+    <w:lsdException w:name="toc 4" w:semiHidden="1" w:uiPriority="39" w:unhideWhenUsed="1"/>
+    <w:lsdException w:name="toc 5" w:semiHidden="1" w:uiPriority="39" w:unhideWhenUsed="1"/>
+    <w:lsdException w:name="toc 6" w:semiHidden="1" w:uiPriority="39" w:unhideWhenUsed="1"/>
+    <w:lsdException w:name="toc 7" w:semiHidden="1" w:uiPriority="39" w:unhideWhenUsed="1"/>
+    <w:lsdException w:name="toc 8" w:semiHidden="1" w:uiPriority="39" w:unhideWhenUsed="1"/>
+    <w:lsdException w:name="toc 9" w:semiHidden="1" w:uiPriority="39" w:unhideWhenUsed="1"/>
     <w:lsdException w:name="Normal Indent" w:semiHidden="1" w:unhideWhenUsed="1"/>
     <w:lsdException w:name="footnote text" w:semiHidden="1" w:unhideWhenUsed="1"/>
     <w:lsdException w:name="annotation text" w:semiHidden="1" w:unhideWhenUsed="1"/>
     <w:lsdException w:name="header" w:semiHidden="1" w:unhideWhenUsed="1"/>
     <w:lsdException w:name="footer" w:semiHidden="1" w:unhideWhenUsed="1"/>
     <w:lsdException w:name="index heading" w:semiHidden="1" w:unhideWhenUsed="1"/>
-    <w:lsdException w:name="caption" w:uiPriority="35" w:semiHidden="1" w:unhideWhenUsed="1" w:qFormat="1"/>
+    <w:lsdException w:name="caption" w:semiHidden="1" w:uiPriority="35" w:unhideWhenUsed="1" w:qFormat="1"/>
     <w:lsdException w:name="table of figures" w:semiHidden="1" w:unhideWhenUsed="1"/>
     <w:lsdException w:name="envelope address" w:semiHidden="1" w:unhideWhenUsed="1"/>
     <w:lsdException w:name="envelope return" w:semiHidden="1" w:unhideWhenUsed="1"/>
@@ -4145,7 +4248,7 @@
     <w:lsdException w:name="Title" w:uiPriority="10" w:qFormat="1"/>
     <w:lsdException w:name="Closing" w:semiHidden="1" w:unhideWhenUsed="1"/>
     <w:lsdException w:name="Signature" w:semiHidden="1" w:unhideWhenUsed="1"/>
-    <w:lsdException w:name="Default Paragraph Font" w:uiPriority="1" w:semiHidden="1" w:unhideWhenUsed="1"/>
+    <w:lsdException w:name="Default Paragraph Font" w:semiHidden="1" w:uiPriority="1" w:unhideWhenUsed="1"/>
     <w:lsdException w:name="Body Text" w:semiHidden="1" w:unhideWhenUsed="1"/>
     <w:lsdException w:name="Body Text Indent" w:semiHidden="1" w:unhideWhenUsed="1"/>
     <w:lsdException w:name="List Continue" w:semiHidden="1" w:unhideWhenUsed="1"/>
@@ -4345,8 +4448,8 @@
     <w:lsdException w:name="Subtle Reference" w:uiPriority="31" w:qFormat="1"/>
     <w:lsdException w:name="Intense Reference" w:uiPriority="32" w:qFormat="1"/>
     <w:lsdException w:name="Book Title" w:uiPriority="33" w:qFormat="1"/>
-    <w:lsdException w:name="Bibliography" w:uiPriority="37" w:semiHidden="1" w:unhideWhenUsed="1"/>
-    <w:lsdException w:name="TOC Heading" w:uiPriority="39" w:semiHidden="1" w:unhideWhenUsed="1" w:qFormat="1"/>
+    <w:lsdException w:name="Bibliography" w:semiHidden="1" w:uiPriority="37" w:unhideWhenUsed="1"/>
+    <w:lsdException w:name="TOC Heading" w:semiHidden="1" w:uiPriority="39" w:unhideWhenUsed="1" w:qFormat="1"/>
     <w:lsdException w:name="Plain Table 1" w:uiPriority="41"/>
     <w:lsdException w:name="Plain Table 2" w:uiPriority="42"/>
     <w:lsdException w:name="Plain Table 3" w:uiPriority="43"/>
@@ -4457,12 +4560,12 @@
     <w:lsdException w:name="Unresolved Mention" w:semiHidden="1" w:unhideWhenUsed="1"/>
     <w:lsdException w:name="Smart Link" w:semiHidden="1" w:unhideWhenUsed="1"/>
   </w:latentStyles>
-  <w:style w:type="paragraph" w:styleId="Normal" w:default="1">
+  <w:style w:type="paragraph" w:default="1" w:styleId="Normal">
     <w:name w:val="Normal"/>
     <w:hidden/>
     <w:rsid w:val="00D662F3"/>
   </w:style>
-  <w:style w:type="paragraph" w:styleId="Heading1">
+  <w:style w:type="paragraph" w:styleId="Ttulo1">
     <w:name w:val="heading 1"/>
     <w:uiPriority w:val="9"/>
     <w:qFormat/>
@@ -4470,7 +4573,7 @@
       <w:keepNext/>
       <w:keepLines/>
       <w:pBdr>
-        <w:bottom w:val="single" w:color="D6DCE4" w:sz="6" w:space="4"/>
+        <w:bottom w:val="single" w:sz="6" w:space="4" w:color="D6DCE4"/>
       </w:pBdr>
       <w:spacing w:before="380" w:after="160"/>
       <w:outlineLvl w:val="0"/>
@@ -4483,7 +4586,7 @@
       <w:szCs w:val="30"/>
     </w:rPr>
   </w:style>
-  <w:style w:type="paragraph" w:styleId="Heading2">
+  <w:style w:type="paragraph" w:styleId="Ttulo2">
     <w:name w:val="heading 2"/>
     <w:uiPriority w:val="9"/>
     <w:semiHidden/>
@@ -4498,7 +4601,7 @@
       <w:szCs w:val="26"/>
     </w:rPr>
   </w:style>
-  <w:style w:type="paragraph" w:styleId="Heading3">
+  <w:style w:type="paragraph" w:styleId="Ttulo3">
     <w:name w:val="heading 3"/>
     <w:uiPriority w:val="9"/>
     <w:semiHidden/>
@@ -4513,7 +4616,7 @@
       <w:szCs w:val="24"/>
     </w:rPr>
   </w:style>
-  <w:style w:type="paragraph" w:styleId="Heading4">
+  <w:style w:type="paragraph" w:styleId="Ttulo4">
     <w:name w:val="heading 4"/>
     <w:uiPriority w:val="9"/>
     <w:semiHidden/>
@@ -4528,7 +4631,7 @@
       <w:color w:val="2E74B5"/>
     </w:rPr>
   </w:style>
-  <w:style w:type="paragraph" w:styleId="Heading5">
+  <w:style w:type="paragraph" w:styleId="Ttulo5">
     <w:name w:val="heading 5"/>
     <w:uiPriority w:val="9"/>
     <w:semiHidden/>
@@ -4541,7 +4644,7 @@
       <w:color w:val="2E74B5"/>
     </w:rPr>
   </w:style>
-  <w:style w:type="paragraph" w:styleId="Heading6">
+  <w:style w:type="paragraph" w:styleId="Ttulo6">
     <w:name w:val="heading 6"/>
     <w:uiPriority w:val="9"/>
     <w:semiHidden/>
@@ -4554,13 +4657,13 @@
       <w:color w:val="1F4D78"/>
     </w:rPr>
   </w:style>
-  <w:style w:type="character" w:styleId="DefaultParagraphFont" w:default="1">
+  <w:style w:type="character" w:default="1" w:styleId="Fuentedeprrafopredeter">
     <w:name w:val="Default Paragraph Font"/>
     <w:uiPriority w:val="1"/>
     <w:semiHidden/>
     <w:unhideWhenUsed/>
   </w:style>
-  <w:style w:type="table" w:styleId="TableNormal" w:default="1">
+  <w:style w:type="table" w:default="1" w:styleId="Tablanormal">
     <w:name w:val="Normal Table"/>
     <w:uiPriority w:val="99"/>
     <w:semiHidden/>
@@ -4575,13 +4678,13 @@
       </w:tblCellMar>
     </w:tblPr>
   </w:style>
-  <w:style w:type="numbering" w:styleId="NoList" w:default="1">
+  <w:style w:type="numbering" w:default="1" w:styleId="Sinlista">
     <w:name w:val="No List"/>
     <w:uiPriority w:val="99"/>
     <w:semiHidden/>
     <w:unhideWhenUsed/>
   </w:style>
-  <w:style w:type="paragraph" w:styleId="Title">
+  <w:style w:type="paragraph" w:styleId="Ttulo">
     <w:name w:val="Title"/>
     <w:uiPriority w:val="10"/>
     <w:qFormat/>
@@ -4590,7 +4693,7 @@
       <w:szCs w:val="56"/>
     </w:rPr>
   </w:style>
-  <w:style w:type="paragraph" w:styleId="Fuerte1" w:customStyle="1">
+  <w:style w:type="paragraph" w:customStyle="1" w:styleId="Fuerte1">
     <w:name w:val="Fuerte1"/>
     <w:qFormat/>
     <w:rPr>
@@ -4598,11 +4701,11 @@
       <w:bCs/>
     </w:rPr>
   </w:style>
-  <w:style w:type="paragraph" w:styleId="ListParagraph">
+  <w:style w:type="paragraph" w:styleId="Prrafodelista">
     <w:name w:val="List Paragraph"/>
     <w:qFormat/>
   </w:style>
-  <w:style w:type="character" w:styleId="Hyperlink">
+  <w:style w:type="character" w:styleId="Hipervnculo">
     <w:name w:val="Hyperlink"/>
     <w:uiPriority w:val="99"/>
     <w:unhideWhenUsed/>
@@ -4611,7 +4714,7 @@
       <w:u w:val="single"/>
     </w:rPr>
   </w:style>
-  <w:style w:type="character" w:styleId="FootnoteReference">
+  <w:style w:type="character" w:styleId="Refdenotaalpie">
     <w:name w:val="footnote reference"/>
     <w:uiPriority w:val="99"/>
     <w:semiHidden/>
@@ -4620,7 +4723,7 @@
       <w:vertAlign w:val="superscript"/>
     </w:rPr>
   </w:style>
-  <w:style w:type="character" w:styleId="EndnoteReference">
+  <w:style w:type="character" w:styleId="Refdenotaalfinal">
     <w:name w:val="endnote reference"/>
     <w:uiPriority w:val="99"/>
     <w:semiHidden/>
@@ -4629,7 +4732,7 @@
       <w:vertAlign w:val="superscript"/>
     </w:rPr>
   </w:style>
-  <w:style w:type="paragraph" w:styleId="TituloModulo" w:customStyle="1">
+  <w:style w:type="paragraph" w:customStyle="1" w:styleId="TituloModulo">
     <w:name w:val="Titulo Modulo"/>
     <w:pPr>
       <w:keepNext/>
@@ -4644,7 +4747,7 @@
       <w:szCs w:val="26"/>
     </w:rPr>
   </w:style>
-  <w:style w:type="paragraph" w:styleId="Etiqueta" w:customStyle="1">
+  <w:style w:type="paragraph" w:customStyle="1" w:styleId="Etiqueta">
     <w:name w:val="Etiqueta"/>
     <w:pPr>
       <w:keepNext/>
@@ -4660,7 +4763,7 @@
       <w:szCs w:val="17"/>
     </w:rPr>
   </w:style>
-  <w:style w:type="paragraph" w:styleId="Piedepagina" w:customStyle="1">
+  <w:style w:type="paragraph" w:customStyle="1" w:styleId="Piedepagina">
     <w:name w:val="Pie de pagina"/>
     <w:pPr>
       <w:spacing w:after="0" w:line="240" w:lineRule="auto"/>
@@ -4671,7 +4774,7 @@
       <w:szCs w:val="17"/>
     </w:rPr>
   </w:style>
-  <w:style w:type="paragraph" w:styleId="Revision">
+  <w:style w:type="paragraph" w:styleId="Revisin">
     <w:name w:val="Revision"/>
     <w:hidden/>
     <w:uiPriority w:val="99"/>
@@ -4681,10 +4784,10 @@
       <w:spacing w:after="0" w:line="240" w:lineRule="auto"/>
     </w:pPr>
   </w:style>
-  <w:style w:type="paragraph" w:styleId="Header">
+  <w:style w:type="paragraph" w:styleId="Encabezado">
     <w:name w:val="header"/>
     <w:basedOn w:val="Normal"/>
-    <w:link w:val="HeaderChar"/>
+    <w:link w:val="EncabezadoCar"/>
     <w:uiPriority w:val="99"/>
     <w:semiHidden/>
     <w:unhideWhenUsed/>
@@ -4697,18 +4800,18 @@
       <w:spacing w:after="0" w:line="240" w:lineRule="auto"/>
     </w:pPr>
   </w:style>
-  <w:style w:type="character" w:styleId="HeaderChar" w:customStyle="1">
-    <w:name w:val="Header Char"/>
-    <w:basedOn w:val="DefaultParagraphFont"/>
-    <w:link w:val="Header"/>
+  <w:style w:type="character" w:customStyle="1" w:styleId="EncabezadoCar">
+    <w:name w:val="Encabezado Car"/>
+    <w:basedOn w:val="Fuentedeprrafopredeter"/>
+    <w:link w:val="Encabezado"/>
     <w:uiPriority w:val="99"/>
     <w:semiHidden/>
     <w:rsid w:val="00305F65"/>
   </w:style>
-  <w:style w:type="paragraph" w:styleId="Footer">
+  <w:style w:type="paragraph" w:styleId="Piedepgina">
     <w:name w:val="footer"/>
     <w:basedOn w:val="Normal"/>
-    <w:link w:val="FooterChar"/>
+    <w:link w:val="PiedepginaCar"/>
     <w:uiPriority w:val="99"/>
     <w:semiHidden/>
     <w:unhideWhenUsed/>
@@ -4721,17 +4824,17 @@
       <w:spacing w:after="0" w:line="240" w:lineRule="auto"/>
     </w:pPr>
   </w:style>
-  <w:style w:type="character" w:styleId="FooterChar" w:customStyle="1">
-    <w:name w:val="Footer Char"/>
-    <w:basedOn w:val="DefaultParagraphFont"/>
-    <w:link w:val="Footer"/>
+  <w:style w:type="character" w:customStyle="1" w:styleId="PiedepginaCar">
+    <w:name w:val="Pie de página Car"/>
+    <w:basedOn w:val="Fuentedeprrafopredeter"/>
+    <w:link w:val="Piedepgina"/>
     <w:uiPriority w:val="99"/>
     <w:semiHidden/>
     <w:rsid w:val="00305F65"/>
   </w:style>
   <w:style w:type="character" w:styleId="Refdecomentario">
-    <w:name w:val="Ref. de comentario"/>
-    <w:basedOn w:val="DefaultParagraphFont"/>
+    <w:name w:val="annotation reference"/>
+    <w:basedOn w:val="Fuentedeprrafopredeter"/>
     <w:uiPriority w:val="99"/>
     <w:semiHidden/>
     <w:unhideWhenUsed/>
@@ -4742,7 +4845,7 @@
     </w:rPr>
   </w:style>
   <w:style w:type="paragraph" w:styleId="Textocomentario">
-    <w:name w:val="Texto comentario"/>
+    <w:name w:val="annotation text"/>
     <w:basedOn w:val="Normal"/>
     <w:link w:val="TextocomentarioCar"/>
     <w:uiPriority w:val="99"/>
@@ -4756,9 +4859,9 @@
       <w:szCs w:val="20"/>
     </w:rPr>
   </w:style>
-  <w:style w:type="character" w:styleId="TextocomentarioCar" w:customStyle="1">
+  <w:style w:type="character" w:customStyle="1" w:styleId="TextocomentarioCar">
     <w:name w:val="Texto comentario Car"/>
-    <w:basedOn w:val="DefaultParagraphFont"/>
+    <w:basedOn w:val="Fuentedeprrafopredeter"/>
     <w:link w:val="Textocomentario"/>
     <w:uiPriority w:val="99"/>
     <w:rsid w:val="00035B05"/>
@@ -4768,7 +4871,7 @@
     </w:rPr>
   </w:style>
   <w:style w:type="paragraph" w:styleId="Asuntodelcomentario">
-    <w:name w:val="Asunto del comentario"/>
+    <w:name w:val="annotation subject"/>
     <w:basedOn w:val="Textocomentario"/>
     <w:next w:val="Textocomentario"/>
     <w:link w:val="AsuntodelcomentarioCar"/>
@@ -4781,7 +4884,7 @@
       <w:bCs/>
     </w:rPr>
   </w:style>
-  <w:style w:type="character" w:styleId="AsuntodelcomentarioCar" w:customStyle="1">
+  <w:style w:type="character" w:customStyle="1" w:styleId="AsuntodelcomentarioCar">
     <w:name w:val="Asunto del comentario Car"/>
     <w:basedOn w:val="TextocomentarioCar"/>
     <w:link w:val="Asuntodelcomentario"/>
@@ -4796,8 +4899,8 @@
     </w:rPr>
   </w:style>
   <w:style w:type="character" w:styleId="Mencionar">
-    <w:name w:val="Mencionar"/>
-    <w:basedOn w:val="DefaultParagraphFont"/>
+    <w:name w:val="Mention"/>
+    <w:basedOn w:val="Fuentedeprrafopredeter"/>
     <w:uiPriority w:val="99"/>
     <w:unhideWhenUsed/>
     <w:rsid w:val="00035B05"/>
@@ -4810,7 +4913,7 @@
 </file>
 
 <file path=word/theme/theme1.xml><?xml version="1.0" encoding="utf-8"?>
-<a:theme xmlns:a="http://schemas.openxmlformats.org/drawingml/2006/main" xmlns:thm15="http://schemas.microsoft.com/office/thememl/2012/main" name="Tema de Office">
+<a:theme xmlns:a="http://schemas.openxmlformats.org/drawingml/2006/main" name="Tema de Office">
   <a:themeElements>
     <a:clrScheme name="Office">
       <a:dk1>
@@ -5125,6 +5228,17 @@
 </file>
 
 <file path=customXml/item1.xml><?xml version="1.0" encoding="utf-8"?>
+<p:properties xmlns:p="http://schemas.microsoft.com/office/2006/metadata/properties" xmlns:xsi="http://www.w3.org/2001/XMLSchema-instance" xmlns:pc="http://schemas.microsoft.com/office/infopath/2007/PartnerControls">
+  <documentManagement>
+    <lcf76f155ced4ddcb4097134ff3c332f xmlns="cb9493c2-5b37-42c8-a622-aa8c9586ac63">
+      <Terms xmlns="http://schemas.microsoft.com/office/infopath/2007/PartnerControls"/>
+    </lcf76f155ced4ddcb4097134ff3c332f>
+    <TaxCatchAll xmlns="746c3b4e-a69a-41f6-8780-3161ee689f0f" xsi:nil="true"/>
+  </documentManagement>
+</p:properties>
+</file>
+
+<file path=customXml/item2.xml><?xml version="1.0" encoding="utf-8"?>
 <ct:contentTypeSchema xmlns:ct="http://schemas.microsoft.com/office/2006/metadata/contentType" xmlns:ma="http://schemas.microsoft.com/office/2006/metadata/properties/metaAttributes" ct:_="" ma:_="" ma:contentTypeName="Documento" ma:contentTypeID="0x010100C78F1E78FAF5DB41B6A3F895AA736E49" ma:contentTypeVersion="15" ma:contentTypeDescription="Crear nuevo documento." ma:contentTypeScope="" ma:versionID="834a0c7eb9af47f08a51e14040269d6d">
   <xsd:schema xmlns:xsd="http://www.w3.org/2001/XMLSchema" xmlns:xs="http://www.w3.org/2001/XMLSchema" xmlns:p="http://schemas.microsoft.com/office/2006/metadata/properties" xmlns:ns2="cb9493c2-5b37-42c8-a622-aa8c9586ac63" xmlns:ns3="746c3b4e-a69a-41f6-8780-3161ee689f0f" targetNamespace="http://schemas.microsoft.com/office/2006/metadata/properties" ma:root="true" ma:fieldsID="ebf5858a942254e2e8e5f3c1c409c420" ns2:_="" ns3:_="">
     <xsd:import namespace="cb9493c2-5b37-42c8-a622-aa8c9586ac63"/>
@@ -5331,17 +5445,6 @@
 </ct:contentTypeSchema>
 </file>
 
-<file path=customXml/item2.xml><?xml version="1.0" encoding="utf-8"?>
-<p:properties xmlns:p="http://schemas.microsoft.com/office/2006/metadata/properties" xmlns:xsi="http://www.w3.org/2001/XMLSchema-instance" xmlns:pc="http://schemas.microsoft.com/office/infopath/2007/PartnerControls">
-  <documentManagement>
-    <lcf76f155ced4ddcb4097134ff3c332f xmlns="cb9493c2-5b37-42c8-a622-aa8c9586ac63">
-      <Terms xmlns="http://schemas.microsoft.com/office/infopath/2007/PartnerControls"/>
-    </lcf76f155ced4ddcb4097134ff3c332f>
-    <TaxCatchAll xmlns="746c3b4e-a69a-41f6-8780-3161ee689f0f" xsi:nil="true"/>
-  </documentManagement>
-</p:properties>
-</file>
-
 <file path=customXml/item3.xml><?xml version="1.0" encoding="utf-8"?>
 <?mso-contentType ?>
 <FormTemplates xmlns="http://schemas.microsoft.com/sharepoint/v3/contenttype/forms">
@@ -5352,6 +5455,17 @@
 </file>
 
 <file path=customXml/itemProps1.xml><?xml version="1.0" encoding="utf-8"?>
+<ds:datastoreItem xmlns:ds="http://schemas.openxmlformats.org/officeDocument/2006/customXml" ds:itemID="{3EECDEEE-C580-4205-B778-2D0F8722B6D3}">
+  <ds:schemaRefs>
+    <ds:schemaRef ds:uri="http://schemas.microsoft.com/office/2006/metadata/properties"/>
+    <ds:schemaRef ds:uri="http://schemas.microsoft.com/office/infopath/2007/PartnerControls"/>
+    <ds:schemaRef ds:uri="cb9493c2-5b37-42c8-a622-aa8c9586ac63"/>
+    <ds:schemaRef ds:uri="746c3b4e-a69a-41f6-8780-3161ee689f0f"/>
+  </ds:schemaRefs>
+</ds:datastoreItem>
+</file>
+
+<file path=customXml/itemProps2.xml><?xml version="1.0" encoding="utf-8"?>
 <ds:datastoreItem xmlns:ds="http://schemas.openxmlformats.org/officeDocument/2006/customXml" ds:itemID="{AD1F4D20-820D-475C-A5DA-B3CA3F71DBD1}">
   <ds:schemaRefs>
     <ds:schemaRef ds:uri="http://schemas.microsoft.com/office/2006/metadata/contentType"/>
@@ -5370,17 +5484,6 @@
 </ds:datastoreItem>
 </file>
 
-<file path=customXml/itemProps2.xml><?xml version="1.0" encoding="utf-8"?>
-<ds:datastoreItem xmlns:ds="http://schemas.openxmlformats.org/officeDocument/2006/customXml" ds:itemID="{3EECDEEE-C580-4205-B778-2D0F8722B6D3}">
-  <ds:schemaRefs>
-    <ds:schemaRef ds:uri="http://schemas.microsoft.com/office/2006/metadata/properties"/>
-    <ds:schemaRef ds:uri="http://schemas.microsoft.com/office/infopath/2007/PartnerControls"/>
-    <ds:schemaRef ds:uri="cb9493c2-5b37-42c8-a622-aa8c9586ac63"/>
-    <ds:schemaRef ds:uri="746c3b4e-a69a-41f6-8780-3161ee689f0f"/>
-  </ds:schemaRefs>
-</ds:datastoreItem>
-</file>
-
 <file path=customXml/itemProps3.xml><?xml version="1.0" encoding="utf-8"?>
 <ds:datastoreItem xmlns:ds="http://schemas.openxmlformats.org/officeDocument/2006/customXml" ds:itemID="{9683A1D3-CE83-4B77-87D5-61C169BE68E3}">
   <ds:schemaRefs>

</xml_diff>